<commit_message>
docs: include finite calibration and limits in official report
</commit_message>
<xml_diff>
--- a/deliverables/report/待编号-2026密码竞赛复赛作品设计报告.docx
+++ b/deliverables/report/待编号-2026密码竞赛复赛作品设计报告.docx
@@ -1615,7 +1615,7 @@
           <w:sz w:val="28"/>
           <w:szCs w:val="28"/>
         </w:rPr>
-        <w:t xml:space="preserve">正常构建覆盖四版KAT、随机源失败、三组功能等价、CLI、向量解析与摘要、普通记录、配对数学/数据/预算失败、成对统计手算、HTML工作流及源码导出。固定S02默认注册31项并实际执行31项；交付修订增加只读性能复算，最终32项由作者新检出验收。历史主动机制采集测试不在默认交付范围，不能拿原注册数代替本次执行。</w:t>
+        <w:t xml:space="preserve">正常构建覆盖四版KAT、随机源失败、功能等价、CLI、向量及摘要、记录与数据资格、配对数学和预算失败、统计手算、工作流及源码导出。普通性能固定S02执行31项；后续只读复算S03增加到32项。有限模型校准S04新增卷积手算检查，原生固定源码的GCC普通与Clang动态各33项通过。各快照按其实际注册与执行解释，旧主动机制计时不在默认交付范围。</w:t>
       </w:r>
     </w:p>
     <w:p>
@@ -1703,7 +1703,7 @@
           <w:sz w:val="28"/>
           <w:szCs w:val="28"/>
         </w:rPr>
-        <w:t xml:space="preserve">Apple M5/ARM64上的普通及ASan/UBSan相关检查通过。最终Linux固定源码在GCC普通构建执行31项，通过；Clang 18 ASan/UBSan同样31项通过。此前GCC sanitizer构建在既有人工补丁的符号转换警告处失败，原日志保留，没有关闭警告或修改封存补丁。不同工具链动态检查不冒充正式性能产物。</w:t>
+        <w:t xml:space="preserve">Apple M5/ARM64实现源的普通及ASan/UBSan检查通过。Linux普通测量固定S02在GCC及Clang动态各执行31项，后续只读验收32项；有限模型校准固定S04两种构建各33项。此前GCC sanitizer在既有人工补丁的符号转换警告处失败，原日志保留，没有关闭警告或修改封存补丁。动态检查不冒充正式性能产物。</w:t>
       </w:r>
     </w:p>
     <w:p>
@@ -5827,21 +5827,16 @@
     </w:tbl>
     <w:p>
       <w:pPr>
-        <w:pStyle w:val="2"/>
+        <w:pStyle w:val="3"/>
         <w:spacing w:before="240" w:after="240" w:line="360" w:lineRule="auto"/>
         <w:rPr>
-          <w:rFonts w:hint="eastAsia" w:ascii="华文楷体" w:hAnsi="华文楷体" w:eastAsia="华文楷体"/>
-          <w:sz w:val="30"/>
-          <w:szCs w:val="30"/>
-        </w:rPr>
-      </w:pPr>
-      <w:r>
-        <w:rPr>
-          <w:rFonts w:hint="eastAsia" w:ascii="华文楷体" w:hAnsi="华文楷体" w:eastAsia="华文楷体"/>
-          <w:sz w:val="30"/>
-          <w:szCs w:val="30"/>
-        </w:rPr>
-        <w:t xml:space="preserve">4.应用前景</w:t>
+          <w:rFonts w:ascii="Times New Roman" w:hAnsi="Times New Roman" w:eastAsia="黑体" w:cs="Times New Roman"/>
+          <w:sz w:val="28"/>
+          <w:szCs w:val="28"/>
+        </w:rPr>
+      </w:pPr>
+      <w:r>
+        <w:t>3.5 有限模型统计校准</w:t>
       </w:r>
     </w:p>
     <w:p>
@@ -5864,7 +5859,7 @@
           <w:sz w:val="28"/>
           <w:szCs w:val="28"/>
         </w:rPr>
-        <w:t xml:space="preserve">作品可作为本地密码实现审计教学及工程复核工具。开发者可以先确认功能和接口，再保存普通运行的完整记录；使用者可从指定文件重分析，核对方法、源身份和限制，减少“只有一个p值”或“只看源码分支”的错误判断。</w:t>
+        <w:t>在观察结果前固定12个成对单位。equal每对幅度为1，graded依次为1至12；差值为delta加正负幅度，五个效应值见表3。独立模型的全部4096种符号组合等概率；共同符号模型各仅两种结果。共40964份数据由C生成和验证，单位为合成ns，不是密码采集时间；没有新的ML-KEM解封装调用，不把模型当真实密码噪声分布。</w:t>
       </w:r>
     </w:p>
     <w:p>
@@ -5887,26 +5882,7 @@
           <w:sz w:val="28"/>
           <w:szCs w:val="28"/>
         </w:rPr>
-        <w:t xml:space="preserve">适用范围是单机ML-KEM-768便携C实现、本地运行与离线复算。未来需要团队在批准的防御测试计划下取得新的受控防护前后数据、进行必要的因果分离，并由实际未参与实现的成员独立执行。云宿主控制不足、其他处理器、优化条件或网络环境的变化都需要新的身份和证据，不能用现有数字外推。</w:t>
-      </w:r>
-    </w:p>
-    <w:p>
-      <w:pPr>
-        <w:pStyle w:val="2"/>
-        <w:spacing w:before="240" w:after="240" w:line="360" w:lineRule="auto"/>
-        <w:rPr>
-          <w:rFonts w:hint="eastAsia" w:ascii="华文楷体" w:hAnsi="华文楷体" w:eastAsia="华文楷体"/>
-          <w:sz w:val="30"/>
-          <w:szCs w:val="30"/>
-        </w:rPr>
-      </w:pPr>
-      <w:r>
-        <w:rPr>
-          <w:rFonts w:hint="eastAsia" w:ascii="华文楷体" w:hAnsi="华文楷体" w:eastAsia="华文楷体"/>
-          <w:sz w:val="30"/>
-          <w:szCs w:val="30"/>
-        </w:rPr>
-        <w:t xml:space="preserve">5. 结论</w:t>
+        <w:t>每份数据分别用现有精确入口和另行实现的整数分布卷积核对，40964份尾计数全部一致；44份预先选定的SciPy审计也一致。独立零效应的误拒绝概率为26/4096和38/4096，均低于alpha=0.01；equal的结果与二项式手算吻合。表3保留全部效应结果，graded在效应4时仍只有353/4096检出；equal在效应1时的一份全零数据保留在分母中。</w:t>
       </w:r>
     </w:p>
     <w:p>
@@ -5929,7 +5905,7 @@
           <w:sz w:val="28"/>
           <w:szCs w:val="28"/>
         </w:rPr>
-        <w:t xml:space="preserve">作品已形成可运行的C11工程、统一使用入口、真实原生普通测量、历史防御案例档案、无秘密精确统计验证、限定强对照效率结果及原始数据复算材料。功能正确、记录完整、有限复算效率和密码安全是四类不同结论。</w:t>
+        <w:t>共同符号模型虽然均值为零，盲用独立交换规则时每个模型都是2/2拒绝；实际成对入口对四份依赖数据均返回证据不足。拒绝签收不等于把误报降至零。该补证支持固定有限模型的错误、检出和资格边界，未校准真实密码总体或真实序列依赖，不提供超越正确配置dudect/RTLF的检测证据。</w:t>
       </w:r>
     </w:p>
     <w:p>
@@ -5952,28 +5928,433 @@
           <w:sz w:val="28"/>
           <w:szCs w:val="28"/>
         </w:rPr>
-        <w:t xml:space="preserve">演示的实际界面截图因工具本地文件访问策略受限，未取得；离线页面和真实程序日志已提供，截图需团队手工完成。未闭合项仍包括新受控防护时序闭环、历史差异的完整因果分离、运行独立性校准和真实非原作者执行。新平台普通性能与静态产物核验不能替代这些证据。作品编号、正式题名、实际分工、签字、意见和盖章由团队真实填写及完成；本报告不宣称已经正式提交或全部要求达标。</w:t>
-      </w:r>
-    </w:p>
-    <w:p>
-      <w:pPr>
-        <w:pStyle w:val="2"/>
-        <w:spacing w:before="240" w:after="240" w:line="360" w:lineRule="auto"/>
-        <w:rPr>
-          <w:rFonts w:hint="eastAsia" w:ascii="华文楷体" w:hAnsi="华文楷体" w:eastAsia="华文楷体"/>
-          <w:sz w:val="30"/>
-          <w:szCs w:val="30"/>
-        </w:rPr>
-      </w:pPr>
-      <w:r>
-        <w:rPr>
-          <w:rFonts w:hint="eastAsia" w:ascii="华文楷体" w:hAnsi="华文楷体" w:eastAsia="华文楷体"/>
-          <w:sz w:val="30"/>
-          <w:szCs w:val="30"/>
-        </w:rPr>
-        <w:t xml:space="preserve">6 来源与复现材料</w:t>
-      </w:r>
-    </w:p>
+        <w:t>表3 固定有限模型的原始拒绝数  每个独立模型4096种结果</w:t>
+      </w:r>
+    </w:p>
+    <w:tbl>
+      <w:tblPr>
+        <w:tblW w:w="9638" w:type="dxa"/>
+        <w:tblBorders>
+          <w:top w:val="single" w:sz="4" w:color="8899A5"/>
+          <w:left w:val="single" w:sz="4" w:color="8899A5"/>
+          <w:bottom w:val="single" w:sz="4" w:color="8899A5"/>
+          <w:right w:val="single" w:sz="4" w:color="8899A5"/>
+          <w:insideH w:val="single" w:sz="4" w:color="8899A5"/>
+          <w:insideV w:val="single" w:sz="4" w:color="8899A5"/>
+        </w:tblBorders>
+      </w:tblPr>
+      <w:tr>
+        <w:trPr>
+          <w:tblHeader/>
+        </w:trPr>
+        <w:tc>
+          <w:tcPr>
+            <w:tcW w:w="3212" w:type="dxa"/>
+          </w:tcPr>
+          <w:p>
+            <w:pPr>
+              <w:widowControl/>
+              <w:adjustRightInd w:val="0"/>
+              <w:snapToGrid w:val="0"/>
+              <w:spacing w:line="340" w:lineRule="exact"/>
+              <w:rPr>
+                <w:rFonts w:ascii="楷体_GB2312" w:hAnsi="Times New Roman" w:eastAsia="楷体_GB2312"/>
+                <w:bCs/>
+                <w:sz w:val="22"/>
+                <w:szCs w:val="28"/>
+              </w:rPr>
+            </w:pPr>
+            <w:r>
+              <w:t>效应delta（合成ns）</w:t>
+            </w:r>
+          </w:p>
+        </w:tc>
+        <w:tc>
+          <w:tcPr>
+            <w:tcW w:w="3212" w:type="dxa"/>
+          </w:tcPr>
+          <w:p>
+            <w:pPr>
+              <w:widowControl/>
+              <w:adjustRightInd w:val="0"/>
+              <w:snapToGrid w:val="0"/>
+              <w:spacing w:line="340" w:lineRule="exact"/>
+              <w:rPr>
+                <w:rFonts w:ascii="楷体_GB2312" w:hAnsi="Times New Roman" w:eastAsia="楷体_GB2312"/>
+                <w:bCs/>
+                <w:sz w:val="22"/>
+                <w:szCs w:val="28"/>
+              </w:rPr>
+            </w:pPr>
+            <w:r>
+              <w:t>equal拒绝数</w:t>
+            </w:r>
+          </w:p>
+        </w:tc>
+        <w:tc>
+          <w:tcPr>
+            <w:tcW w:w="3212" w:type="dxa"/>
+          </w:tcPr>
+          <w:p>
+            <w:pPr>
+              <w:widowControl/>
+              <w:adjustRightInd w:val="0"/>
+              <w:snapToGrid w:val="0"/>
+              <w:spacing w:line="340" w:lineRule="exact"/>
+              <w:rPr>
+                <w:rFonts w:ascii="楷体_GB2312" w:hAnsi="Times New Roman" w:eastAsia="楷体_GB2312"/>
+                <w:bCs/>
+                <w:sz w:val="22"/>
+                <w:szCs w:val="28"/>
+              </w:rPr>
+            </w:pPr>
+            <w:r>
+              <w:t>graded拒绝数</w:t>
+            </w:r>
+          </w:p>
+        </w:tc>
+      </w:tr>
+      <w:tr>
+        <w:tc>
+          <w:tcPr>
+            <w:tcW w:w="3212" w:type="dxa"/>
+          </w:tcPr>
+          <w:p>
+            <w:pPr>
+              <w:widowControl/>
+              <w:adjustRightInd w:val="0"/>
+              <w:snapToGrid w:val="0"/>
+              <w:spacing w:line="340" w:lineRule="exact"/>
+              <w:rPr>
+                <w:rFonts w:ascii="楷体_GB2312" w:hAnsi="Times New Roman" w:eastAsia="楷体_GB2312"/>
+                <w:bCs/>
+                <w:sz w:val="22"/>
+                <w:szCs w:val="28"/>
+              </w:rPr>
+            </w:pPr>
+            <w:r>
+              <w:t>0</w:t>
+            </w:r>
+          </w:p>
+        </w:tc>
+        <w:tc>
+          <w:tcPr>
+            <w:tcW w:w="3212" w:type="dxa"/>
+          </w:tcPr>
+          <w:p>
+            <w:pPr>
+              <w:widowControl/>
+              <w:adjustRightInd w:val="0"/>
+              <w:snapToGrid w:val="0"/>
+              <w:spacing w:line="340" w:lineRule="exact"/>
+              <w:rPr>
+                <w:rFonts w:ascii="楷体_GB2312" w:hAnsi="Times New Roman" w:eastAsia="楷体_GB2312"/>
+                <w:bCs/>
+                <w:sz w:val="22"/>
+                <w:szCs w:val="28"/>
+              </w:rPr>
+            </w:pPr>
+            <w:r>
+              <w:t>26</w:t>
+            </w:r>
+          </w:p>
+        </w:tc>
+        <w:tc>
+          <w:tcPr>
+            <w:tcW w:w="3212" w:type="dxa"/>
+          </w:tcPr>
+          <w:p>
+            <w:pPr>
+              <w:widowControl/>
+              <w:adjustRightInd w:val="0"/>
+              <w:snapToGrid w:val="0"/>
+              <w:spacing w:line="340" w:lineRule="exact"/>
+              <w:rPr>
+                <w:rFonts w:ascii="楷体_GB2312" w:hAnsi="Times New Roman" w:eastAsia="楷体_GB2312"/>
+                <w:bCs/>
+                <w:sz w:val="22"/>
+                <w:szCs w:val="28"/>
+              </w:rPr>
+            </w:pPr>
+            <w:r>
+              <w:t>38</w:t>
+            </w:r>
+          </w:p>
+        </w:tc>
+      </w:tr>
+      <w:tr>
+        <w:tc>
+          <w:tcPr>
+            <w:tcW w:w="3212" w:type="dxa"/>
+          </w:tcPr>
+          <w:p>
+            <w:pPr>
+              <w:widowControl/>
+              <w:adjustRightInd w:val="0"/>
+              <w:snapToGrid w:val="0"/>
+              <w:spacing w:line="340" w:lineRule="exact"/>
+              <w:rPr>
+                <w:rFonts w:ascii="楷体_GB2312" w:hAnsi="Times New Roman" w:eastAsia="楷体_GB2312"/>
+                <w:bCs/>
+                <w:sz w:val="22"/>
+                <w:szCs w:val="28"/>
+              </w:rPr>
+            </w:pPr>
+            <w:r>
+              <w:t>1</w:t>
+            </w:r>
+          </w:p>
+        </w:tc>
+        <w:tc>
+          <w:tcPr>
+            <w:tcW w:w="3212" w:type="dxa"/>
+          </w:tcPr>
+          <w:p>
+            <w:pPr>
+              <w:widowControl/>
+              <w:adjustRightInd w:val="0"/>
+              <w:snapToGrid w:val="0"/>
+              <w:spacing w:line="340" w:lineRule="exact"/>
+              <w:rPr>
+                <w:rFonts w:ascii="楷体_GB2312" w:hAnsi="Times New Roman" w:eastAsia="楷体_GB2312"/>
+                <w:bCs/>
+                <w:sz w:val="22"/>
+                <w:szCs w:val="28"/>
+              </w:rPr>
+            </w:pPr>
+            <w:r>
+              <w:t>794</w:t>
+            </w:r>
+          </w:p>
+        </w:tc>
+        <w:tc>
+          <w:tcPr>
+            <w:tcW w:w="3212" w:type="dxa"/>
+          </w:tcPr>
+          <w:p>
+            <w:pPr>
+              <w:widowControl/>
+              <w:adjustRightInd w:val="0"/>
+              <w:snapToGrid w:val="0"/>
+              <w:spacing w:line="340" w:lineRule="exact"/>
+              <w:rPr>
+                <w:rFonts w:ascii="楷体_GB2312" w:hAnsi="Times New Roman" w:eastAsia="楷体_GB2312"/>
+                <w:bCs/>
+                <w:sz w:val="22"/>
+                <w:szCs w:val="28"/>
+              </w:rPr>
+            </w:pPr>
+            <w:r>
+              <w:t>48</w:t>
+            </w:r>
+          </w:p>
+        </w:tc>
+      </w:tr>
+      <w:tr>
+        <w:tc>
+          <w:tcPr>
+            <w:tcW w:w="3212" w:type="dxa"/>
+          </w:tcPr>
+          <w:p>
+            <w:pPr>
+              <w:widowControl/>
+              <w:adjustRightInd w:val="0"/>
+              <w:snapToGrid w:val="0"/>
+              <w:spacing w:line="340" w:lineRule="exact"/>
+              <w:rPr>
+                <w:rFonts w:ascii="楷体_GB2312" w:hAnsi="Times New Roman" w:eastAsia="楷体_GB2312"/>
+                <w:bCs/>
+                <w:sz w:val="22"/>
+                <w:szCs w:val="28"/>
+              </w:rPr>
+            </w:pPr>
+            <w:r>
+              <w:t>2</w:t>
+            </w:r>
+          </w:p>
+        </w:tc>
+        <w:tc>
+          <w:tcPr>
+            <w:tcW w:w="3212" w:type="dxa"/>
+          </w:tcPr>
+          <w:p>
+            <w:pPr>
+              <w:widowControl/>
+              <w:adjustRightInd w:val="0"/>
+              <w:snapToGrid w:val="0"/>
+              <w:spacing w:line="340" w:lineRule="exact"/>
+              <w:rPr>
+                <w:rFonts w:ascii="楷体_GB2312" w:hAnsi="Times New Roman" w:eastAsia="楷体_GB2312"/>
+                <w:bCs/>
+                <w:sz w:val="22"/>
+                <w:szCs w:val="28"/>
+              </w:rPr>
+            </w:pPr>
+            <w:r>
+              <w:t>4096</w:t>
+            </w:r>
+          </w:p>
+        </w:tc>
+        <w:tc>
+          <w:tcPr>
+            <w:tcW w:w="3212" w:type="dxa"/>
+          </w:tcPr>
+          <w:p>
+            <w:pPr>
+              <w:widowControl/>
+              <w:adjustRightInd w:val="0"/>
+              <w:snapToGrid w:val="0"/>
+              <w:spacing w:line="340" w:lineRule="exact"/>
+              <w:rPr>
+                <w:rFonts w:ascii="楷体_GB2312" w:hAnsi="Times New Roman" w:eastAsia="楷体_GB2312"/>
+                <w:bCs/>
+                <w:sz w:val="22"/>
+                <w:szCs w:val="28"/>
+              </w:rPr>
+            </w:pPr>
+            <w:r>
+              <w:t>91</w:t>
+            </w:r>
+          </w:p>
+        </w:tc>
+      </w:tr>
+      <w:tr>
+        <w:tc>
+          <w:tcPr>
+            <w:tcW w:w="3212" w:type="dxa"/>
+          </w:tcPr>
+          <w:p>
+            <w:pPr>
+              <w:widowControl/>
+              <w:adjustRightInd w:val="0"/>
+              <w:snapToGrid w:val="0"/>
+              <w:spacing w:line="340" w:lineRule="exact"/>
+              <w:rPr>
+                <w:rFonts w:ascii="楷体_GB2312" w:hAnsi="Times New Roman" w:eastAsia="楷体_GB2312"/>
+                <w:bCs/>
+                <w:sz w:val="22"/>
+                <w:szCs w:val="28"/>
+              </w:rPr>
+            </w:pPr>
+            <w:r>
+              <w:t>4</w:t>
+            </w:r>
+          </w:p>
+        </w:tc>
+        <w:tc>
+          <w:tcPr>
+            <w:tcW w:w="3212" w:type="dxa"/>
+          </w:tcPr>
+          <w:p>
+            <w:pPr>
+              <w:widowControl/>
+              <w:adjustRightInd w:val="0"/>
+              <w:snapToGrid w:val="0"/>
+              <w:spacing w:line="340" w:lineRule="exact"/>
+              <w:rPr>
+                <w:rFonts w:ascii="楷体_GB2312" w:hAnsi="Times New Roman" w:eastAsia="楷体_GB2312"/>
+                <w:bCs/>
+                <w:sz w:val="22"/>
+                <w:szCs w:val="28"/>
+              </w:rPr>
+            </w:pPr>
+            <w:r>
+              <w:t>4096</w:t>
+            </w:r>
+          </w:p>
+        </w:tc>
+        <w:tc>
+          <w:tcPr>
+            <w:tcW w:w="3212" w:type="dxa"/>
+          </w:tcPr>
+          <w:p>
+            <w:pPr>
+              <w:widowControl/>
+              <w:adjustRightInd w:val="0"/>
+              <w:snapToGrid w:val="0"/>
+              <w:spacing w:line="340" w:lineRule="exact"/>
+              <w:rPr>
+                <w:rFonts w:ascii="楷体_GB2312" w:hAnsi="Times New Roman" w:eastAsia="楷体_GB2312"/>
+                <w:bCs/>
+                <w:sz w:val="22"/>
+                <w:szCs w:val="28"/>
+              </w:rPr>
+            </w:pPr>
+            <w:r>
+              <w:t>353</w:t>
+            </w:r>
+          </w:p>
+        </w:tc>
+      </w:tr>
+      <w:tr>
+        <w:tc>
+          <w:tcPr>
+            <w:tcW w:w="3212" w:type="dxa"/>
+          </w:tcPr>
+          <w:p>
+            <w:pPr>
+              <w:widowControl/>
+              <w:adjustRightInd w:val="0"/>
+              <w:snapToGrid w:val="0"/>
+              <w:spacing w:line="340" w:lineRule="exact"/>
+              <w:rPr>
+                <w:rFonts w:ascii="楷体_GB2312" w:hAnsi="Times New Roman" w:eastAsia="楷体_GB2312"/>
+                <w:bCs/>
+                <w:sz w:val="22"/>
+                <w:szCs w:val="28"/>
+              </w:rPr>
+            </w:pPr>
+            <w:r>
+              <w:t>12</w:t>
+            </w:r>
+          </w:p>
+        </w:tc>
+        <w:tc>
+          <w:tcPr>
+            <w:tcW w:w="3212" w:type="dxa"/>
+          </w:tcPr>
+          <w:p>
+            <w:pPr>
+              <w:widowControl/>
+              <w:adjustRightInd w:val="0"/>
+              <w:snapToGrid w:val="0"/>
+              <w:spacing w:line="340" w:lineRule="exact"/>
+              <w:rPr>
+                <w:rFonts w:ascii="楷体_GB2312" w:hAnsi="Times New Roman" w:eastAsia="楷体_GB2312"/>
+                <w:bCs/>
+                <w:sz w:val="22"/>
+                <w:szCs w:val="28"/>
+              </w:rPr>
+            </w:pPr>
+            <w:r>
+              <w:t>4096</w:t>
+            </w:r>
+          </w:p>
+        </w:tc>
+        <w:tc>
+          <w:tcPr>
+            <w:tcW w:w="3212" w:type="dxa"/>
+          </w:tcPr>
+          <w:p>
+            <w:pPr>
+              <w:widowControl/>
+              <w:adjustRightInd w:val="0"/>
+              <w:snapToGrid w:val="0"/>
+              <w:spacing w:line="340" w:lineRule="exact"/>
+              <w:rPr>
+                <w:rFonts w:ascii="楷体_GB2312" w:hAnsi="Times New Roman" w:eastAsia="楷体_GB2312"/>
+                <w:bCs/>
+                <w:sz w:val="22"/>
+                <w:szCs w:val="28"/>
+              </w:rPr>
+            </w:pPr>
+            <w:r>
+              <w:t>4096</w:t>
+            </w:r>
+          </w:p>
+        </w:tc>
+      </w:tr>
+    </w:tbl>
     <w:p>
       <w:pPr>
         <w:widowControl/>
@@ -5986,16 +6367,34 @@
           <w:sz w:val="28"/>
           <w:szCs w:val="28"/>
         </w:rPr>
-        <w:jc w:val="left"/>
-      </w:pPr>
-      <w:r>
-        <w:rPr>
-          <w:rFonts w:ascii="楷体_GB2312" w:hAnsi="Times New Roman" w:eastAsia="楷体_GB2312"/>
-          <w:bCs/>
-          <w:sz w:val="28"/>
-          <w:szCs w:val="28"/>
-        </w:rPr>
-        <w:t xml:space="preserve">[1] NIST. Module-Lattice-Based Key-Encapsulation Mechanism Standard. FIPS 203, 2024. https://csrc.nist.gov/pubs/fips/203/final</w:t>
+      </w:pPr>
+      <w:r>
+        <w:rPr>
+          <w:rFonts w:ascii="楷体_GB2312" w:hAnsi="Times New Roman" w:eastAsia="楷体_GB2312"/>
+          <w:bCs/>
+          <w:sz w:val="28"/>
+          <w:szCs w:val="28"/>
+        </w:rPr>
+        <w:t>表3来源：C02有限模型原始记录及C报告；效应0为模型内误拒绝，其余为该模型检出，不估计真实密码总体概率。</w:t>
+      </w:r>
+    </w:p>
+    <w:p>
+      <w:pPr>
+        <w:pStyle w:val="2"/>
+        <w:spacing w:before="240" w:after="240" w:line="360" w:lineRule="auto"/>
+        <w:rPr>
+          <w:rFonts w:hint="eastAsia" w:ascii="华文楷体" w:hAnsi="华文楷体" w:eastAsia="华文楷体"/>
+          <w:sz w:val="30"/>
+          <w:szCs w:val="30"/>
+        </w:rPr>
+      </w:pPr>
+      <w:r>
+        <w:rPr>
+          <w:rFonts w:hint="eastAsia" w:ascii="华文楷体" w:hAnsi="华文楷体" w:eastAsia="华文楷体"/>
+          <w:sz w:val="30"/>
+          <w:szCs w:val="30"/>
+        </w:rPr>
+        <w:t xml:space="preserve">4.应用前景</w:t>
       </w:r>
     </w:p>
     <w:p>
@@ -6010,16 +6409,15 @@
           <w:sz w:val="28"/>
           <w:szCs w:val="28"/>
         </w:rPr>
-        <w:jc w:val="left"/>
-      </w:pPr>
-      <w:r>
-        <w:rPr>
-          <w:rFonts w:ascii="楷体_GB2312" w:hAnsi="Times New Roman" w:eastAsia="楷体_GB2312"/>
-          <w:bCs/>
-          <w:sz w:val="28"/>
-          <w:szCs w:val="28"/>
-        </w:rPr>
-        <w:t xml:space="preserve">[2] pq-code-package. mlkem-native. 固定b3ba7b32773e657dd37f6f87bce82528459ad8a4；许可证见源码原件。https://github.com/pq-code-package/mlkem-native</w:t>
+      </w:pPr>
+      <w:r>
+        <w:rPr>
+          <w:rFonts w:ascii="楷体_GB2312" w:hAnsi="Times New Roman" w:eastAsia="楷体_GB2312"/>
+          <w:bCs/>
+          <w:sz w:val="28"/>
+          <w:szCs w:val="28"/>
+        </w:rPr>
+        <w:t xml:space="preserve">作品可作为本地密码实现审计教学及工程复核工具。开发者可以先确认功能和接口，再保存普通运行的完整记录；使用者可从指定文件重分析，核对方法、源身份和限制，减少“只有一个p值”或“只看源码分支”的错误判断。</w:t>
       </w:r>
     </w:p>
     <w:p>
@@ -6034,16 +6432,34 @@
           <w:sz w:val="28"/>
           <w:szCs w:val="28"/>
         </w:rPr>
-        <w:jc w:val="left"/>
-      </w:pPr>
-      <w:r>
-        <w:rPr>
-          <w:rFonts w:ascii="楷体_GB2312" w:hAnsi="Times New Roman" w:eastAsia="楷体_GB2312"/>
-          <w:bCs/>
-          <w:sz w:val="28"/>
-          <w:szCs w:val="28"/>
-        </w:rPr>
-        <w:t xml:space="preserve">[3] Reparaz O, Balasch J, Verbauwhede I. Dude, is my code constant time? DATE 2017；dudect固定dc269651fb2567e46755cfb2a13d3875592968b5。https://github.com/oreparaz/dudect</w:t>
+      </w:pPr>
+      <w:r>
+        <w:rPr>
+          <w:rFonts w:ascii="楷体_GB2312" w:hAnsi="Times New Roman" w:eastAsia="楷体_GB2312"/>
+          <w:bCs/>
+          <w:sz w:val="28"/>
+          <w:szCs w:val="28"/>
+        </w:rPr>
+        <w:t xml:space="preserve">适用范围是单机ML-KEM-768便携C实现、本地运行与离线复算。未来需要团队在批准的防御测试计划下取得新的受控防护前后数据、进行必要的因果分离，并由实际未参与实现的成员独立执行。云宿主控制不足、其他处理器、优化条件或网络环境的变化都需要新的身份和证据，不能用现有数字外推。</w:t>
+      </w:r>
+    </w:p>
+    <w:p>
+      <w:pPr>
+        <w:pStyle w:val="2"/>
+        <w:spacing w:before="240" w:after="240" w:line="360" w:lineRule="auto"/>
+        <w:rPr>
+          <w:rFonts w:hint="eastAsia" w:ascii="华文楷体" w:hAnsi="华文楷体" w:eastAsia="华文楷体"/>
+          <w:sz w:val="30"/>
+          <w:szCs w:val="30"/>
+        </w:rPr>
+      </w:pPr>
+      <w:r>
+        <w:rPr>
+          <w:rFonts w:hint="eastAsia" w:ascii="华文楷体" w:hAnsi="华文楷体" w:eastAsia="华文楷体"/>
+          <w:sz w:val="30"/>
+          <w:szCs w:val="30"/>
+        </w:rPr>
+        <w:t xml:space="preserve">5. 结论</w:t>
       </w:r>
     </w:p>
     <w:p>
@@ -6058,16 +6474,15 @@
           <w:sz w:val="28"/>
           <w:szCs w:val="28"/>
         </w:rPr>
-        <w:jc w:val="left"/>
-      </w:pPr>
-      <w:r>
-        <w:rPr>
-          <w:rFonts w:ascii="楷体_GB2312" w:hAnsi="Times New Roman" w:eastAsia="楷体_GB2312"/>
-          <w:bCs/>
-          <w:sz w:val="28"/>
-          <w:szCs w:val="28"/>
-        </w:rPr>
-        <w:t xml:space="preserve">[4] Dunsche M, et al. With Great Power Come Great Side Channels: Statistical Timing Side-Channel Analyses with Bounded Type-1 Errors. USENIX Security 2024；已核对官方勘误。https://www.usenix.org/conference/usenixsecurity24/presentation/dunsche</w:t>
+      </w:pPr>
+      <w:r>
+        <w:rPr>
+          <w:rFonts w:ascii="楷体_GB2312" w:hAnsi="Times New Roman" w:eastAsia="楷体_GB2312"/>
+          <w:bCs/>
+          <w:sz w:val="28"/>
+          <w:szCs w:val="28"/>
+        </w:rPr>
+        <w:t xml:space="preserve">作品已形成可运行的C11工程、统一使用入口、真实原生普通测量、历史防御案例档案、无秘密精确统计验证、限定强对照效率结果及原始数据复算材料。功能正确、记录完整、有限复算效率和密码安全是四类不同结论。</w:t>
       </w:r>
     </w:p>
     <w:p>
@@ -6082,16 +6497,34 @@
           <w:sz w:val="28"/>
           <w:szCs w:val="28"/>
         </w:rPr>
-        <w:jc w:val="left"/>
-      </w:pPr>
-      <w:r>
-        <w:rPr>
-          <w:rFonts w:ascii="楷体_GB2312" w:hAnsi="Times New Roman" w:eastAsia="楷体_GB2312"/>
-          <w:bCs/>
-          <w:sz w:val="28"/>
-          <w:szCs w:val="28"/>
-        </w:rPr>
-        <w:t xml:space="preserve">[5] SciPy. permutation_test官方定义；对照实际版本SciPy1.16.3/NumPy2.3.5。https://docs.scipy.org/doc/scipy/reference/generated/scipy.stats.permutation_test.html</w:t>
+      </w:pPr>
+      <w:r>
+        <w:rPr>
+          <w:rFonts w:ascii="楷体_GB2312" w:hAnsi="Times New Roman" w:eastAsia="楷体_GB2312"/>
+          <w:bCs/>
+          <w:sz w:val="28"/>
+          <w:szCs w:val="28"/>
+        </w:rPr>
+        <w:t xml:space="preserve">演示的实际界面截图因工具本地文件访问策略受限，未取得；离线页面和真实程序日志已提供，截图需团队手工完成。未闭合项仍包括新受控防护时序闭环、历史差异的完整因果分离、运行独立性校准和真实非原作者执行。新平台普通性能与静态产物核验不能替代这些证据。作品编号、正式题名、实际分工、签字、意见和盖章由团队真实填写及完成；本报告不宣称已经正式提交或全部要求达标。</w:t>
+      </w:r>
+    </w:p>
+    <w:p>
+      <w:pPr>
+        <w:pStyle w:val="2"/>
+        <w:spacing w:before="240" w:after="240" w:line="360" w:lineRule="auto"/>
+        <w:rPr>
+          <w:rFonts w:hint="eastAsia" w:ascii="华文楷体" w:hAnsi="华文楷体" w:eastAsia="华文楷体"/>
+          <w:sz w:val="30"/>
+          <w:szCs w:val="30"/>
+        </w:rPr>
+      </w:pPr>
+      <w:r>
+        <w:rPr>
+          <w:rFonts w:hint="eastAsia" w:ascii="华文楷体" w:hAnsi="华文楷体" w:eastAsia="华文楷体"/>
+          <w:sz w:val="30"/>
+          <w:szCs w:val="30"/>
+        </w:rPr>
+        <w:t xml:space="preserve">6 来源与复现材料</w:t>
       </w:r>
     </w:p>
     <w:p>
@@ -6115,7 +6548,7 @@
           <w:sz w:val="28"/>
           <w:szCs w:val="28"/>
         </w:rPr>
-        <w:t xml:space="preserve">[6] clangover机制出处固定7f4d5dc162b77c362a34a0d52949f7a3e1b16d81，原对象是旧Kyber，不能冒称FIPS 203。https://github.com/antoonpurnal/clangover</w:t>
+        <w:t xml:space="preserve">[1] NIST. Module-Lattice-Based Key-Encapsulation Mechanism Standard. FIPS 203, 2024. https://csrc.nist.gov/pubs/fips/203/final</w:t>
       </w:r>
     </w:p>
     <w:p>
@@ -6130,15 +6563,16 @@
           <w:sz w:val="28"/>
           <w:szCs w:val="28"/>
         </w:rPr>
-      </w:pPr>
-      <w:r>
-        <w:rPr>
-          <w:rFonts w:ascii="楷体_GB2312" w:hAnsi="Times New Roman" w:eastAsia="楷体_GB2312"/>
-          <w:bCs/>
-          <w:sz w:val="28"/>
-          <w:szCs w:val="28"/>
-        </w:rPr>
-        <w:t xml:space="preserve">证据索引：E01原生参考前置；E02原生普通三实现性能及产物；H01历史人工回归与统计审计；C01无秘密精确复算确认；R01干净作者复现。分发清单采用相对路径与角色编号，内部原件不改写；数值CSV保持原字节，转换后的元数据有新的分发摘要。</w:t>
+        <w:jc w:val="left"/>
+      </w:pPr>
+      <w:r>
+        <w:rPr>
+          <w:rFonts w:ascii="楷体_GB2312" w:hAnsi="Times New Roman" w:eastAsia="楷体_GB2312"/>
+          <w:bCs/>
+          <w:sz w:val="28"/>
+          <w:szCs w:val="28"/>
+        </w:rPr>
+        <w:t xml:space="preserve">[2] pq-code-package. mlkem-native. 固定b3ba7b32773e657dd37f6f87bce82528459ad8a4；许可证见源码原件。https://github.com/pq-code-package/mlkem-native</w:t>
       </w:r>
     </w:p>
     <w:p>
@@ -6153,15 +6587,134 @@
           <w:sz w:val="28"/>
           <w:szCs w:val="28"/>
         </w:rPr>
-      </w:pPr>
-      <w:r>
-        <w:rPr>
-          <w:rFonts w:ascii="楷体_GB2312" w:hAnsi="Times New Roman" w:eastAsia="楷体_GB2312"/>
-          <w:bCs/>
-          <w:sz w:val="28"/>
-          <w:szCs w:val="28"/>
-        </w:rPr>
-        <w:t xml:space="preserve">复现入口：cmake --preset baseline；cmake --build --preset baseline --parallel 4；build/cmake/audit check。历史复算：audit replay 源码目录 新输出目录。成对复算：audit analyze-pairs CSV PLAN 新报告。真实独立执行仍需执行者填写身份、源/数据摘要、命令及退出码、差异和签收记录。</w:t>
+        <w:jc w:val="left"/>
+      </w:pPr>
+      <w:r>
+        <w:rPr>
+          <w:rFonts w:ascii="楷体_GB2312" w:hAnsi="Times New Roman" w:eastAsia="楷体_GB2312"/>
+          <w:bCs/>
+          <w:sz w:val="28"/>
+          <w:szCs w:val="28"/>
+        </w:rPr>
+        <w:t xml:space="preserve">[3] Reparaz O, Balasch J, Verbauwhede I. Dude, is my code constant time? DATE 2017；dudect固定dc269651fb2567e46755cfb2a13d3875592968b5。https://github.com/oreparaz/dudect</w:t>
+      </w:r>
+    </w:p>
+    <w:p>
+      <w:pPr>
+        <w:widowControl/>
+        <w:adjustRightInd w:val="0"/>
+        <w:snapToGrid w:val="0"/>
+        <w:spacing w:line="480" w:lineRule="exact"/>
+        <w:rPr>
+          <w:rFonts w:ascii="楷体_GB2312" w:hAnsi="Times New Roman" w:eastAsia="楷体_GB2312"/>
+          <w:bCs/>
+          <w:sz w:val="28"/>
+          <w:szCs w:val="28"/>
+        </w:rPr>
+        <w:jc w:val="left"/>
+      </w:pPr>
+      <w:r>
+        <w:rPr>
+          <w:rFonts w:ascii="楷体_GB2312" w:hAnsi="Times New Roman" w:eastAsia="楷体_GB2312"/>
+          <w:bCs/>
+          <w:sz w:val="28"/>
+          <w:szCs w:val="28"/>
+        </w:rPr>
+        <w:t xml:space="preserve">[4] Dunsche M, et al. With Great Power Come Great Side Channels: Statistical Timing Side-Channel Analyses with Bounded Type-1 Errors. USENIX Security 2024；已核对官方勘误。https://www.usenix.org/conference/usenixsecurity24/presentation/dunsche</w:t>
+      </w:r>
+    </w:p>
+    <w:p>
+      <w:pPr>
+        <w:widowControl/>
+        <w:adjustRightInd w:val="0"/>
+        <w:snapToGrid w:val="0"/>
+        <w:spacing w:line="480" w:lineRule="exact"/>
+        <w:rPr>
+          <w:rFonts w:ascii="楷体_GB2312" w:hAnsi="Times New Roman" w:eastAsia="楷体_GB2312"/>
+          <w:bCs/>
+          <w:sz w:val="28"/>
+          <w:szCs w:val="28"/>
+        </w:rPr>
+        <w:jc w:val="left"/>
+      </w:pPr>
+      <w:r>
+        <w:rPr>
+          <w:rFonts w:ascii="楷体_GB2312" w:hAnsi="Times New Roman" w:eastAsia="楷体_GB2312"/>
+          <w:bCs/>
+          <w:sz w:val="28"/>
+          <w:szCs w:val="28"/>
+        </w:rPr>
+        <w:t xml:space="preserve">[5] SciPy. permutation_test官方定义；对照实际版本SciPy1.16.3/NumPy2.3.5。https://docs.scipy.org/doc/scipy/reference/generated/scipy.stats.permutation_test.html</w:t>
+      </w:r>
+    </w:p>
+    <w:p>
+      <w:pPr>
+        <w:widowControl/>
+        <w:adjustRightInd w:val="0"/>
+        <w:snapToGrid w:val="0"/>
+        <w:spacing w:line="480" w:lineRule="exact"/>
+        <w:rPr>
+          <w:rFonts w:ascii="楷体_GB2312" w:hAnsi="Times New Roman" w:eastAsia="楷体_GB2312"/>
+          <w:bCs/>
+          <w:sz w:val="28"/>
+          <w:szCs w:val="28"/>
+        </w:rPr>
+        <w:jc w:val="left"/>
+      </w:pPr>
+      <w:r>
+        <w:rPr>
+          <w:rFonts w:ascii="楷体_GB2312" w:hAnsi="Times New Roman" w:eastAsia="楷体_GB2312"/>
+          <w:bCs/>
+          <w:sz w:val="28"/>
+          <w:szCs w:val="28"/>
+        </w:rPr>
+        <w:t xml:space="preserve">[6] clangover机制出处固定7f4d5dc162b77c362a34a0d52949f7a3e1b16d81，原对象是旧Kyber，不能冒称FIPS 203。https://github.com/antoonpurnal/clangover</w:t>
+      </w:r>
+    </w:p>
+    <w:p>
+      <w:pPr>
+        <w:widowControl/>
+        <w:adjustRightInd w:val="0"/>
+        <w:snapToGrid w:val="0"/>
+        <w:spacing w:line="480" w:lineRule="exact"/>
+        <w:rPr>
+          <w:rFonts w:ascii="楷体_GB2312" w:hAnsi="Times New Roman" w:eastAsia="楷体_GB2312"/>
+          <w:bCs/>
+          <w:sz w:val="28"/>
+          <w:szCs w:val="28"/>
+        </w:rPr>
+      </w:pPr>
+      <w:r>
+        <w:rPr>
+          <w:rFonts w:ascii="楷体_GB2312" w:hAnsi="Times New Roman" w:eastAsia="楷体_GB2312"/>
+          <w:bCs/>
+          <w:sz w:val="28"/>
+          <w:szCs w:val="28"/>
+        </w:rPr>
+        <w:t xml:space="preserve">证据索引：E01原生参考前置；E02原生普通三实现性能及产物；H01历史人工回归与统计审计；C01精确复算效率确认；C02无秘密有限模型校准；R01干净作者复现。分发清单采用相对路径与角色编号，内部原件不改；数值CSV保持原字节，转换后的元数据有新的分发摘要。</w:t>
+      </w:r>
+    </w:p>
+    <w:p>
+      <w:pPr>
+        <w:widowControl/>
+        <w:adjustRightInd w:val="0"/>
+        <w:snapToGrid w:val="0"/>
+        <w:spacing w:line="480" w:lineRule="exact"/>
+        <w:rPr>
+          <w:rFonts w:ascii="楷体_GB2312" w:hAnsi="Times New Roman" w:eastAsia="楷体_GB2312"/>
+          <w:bCs/>
+          <w:sz w:val="28"/>
+          <w:szCs w:val="28"/>
+        </w:rPr>
+      </w:pPr>
+      <w:r>
+        <w:rPr>
+          <w:rFonts w:ascii="楷体_GB2312" w:hAnsi="Times New Roman" w:eastAsia="楷体_GB2312"/>
+          <w:bCs/>
+          <w:sz w:val="28"/>
+          <w:szCs w:val="28"/>
+        </w:rPr>
+        <w:t xml:space="preserve">复现入口：cmake --preset baseline；cmake --build --preset baseline --parallel 4；build/cmake/audit check。历史复算：audit replay 源码目录 新目录；成对复算：audit analyze-pairs CSV PLAN 新报告；模型校准：audit calibrate 新目录。真实独立执行仍需实际执行者保留源/数据摘要、命令、退出码、差异及签收记录。</w:t>
       </w:r>
     </w:p>
     <w:sectPr>

</xml_diff>

<commit_message>
docs: substantiate scoped contribution after baseline import
</commit_message>
<xml_diff>
--- a/deliverables/report/待编号-2026密码竞赛复赛作品设计报告.docx
+++ b/deliverables/report/待编号-2026密码竞赛复赛作品设计报告.docx
@@ -1011,7 +1011,7 @@
                 <w:rFonts w:hint="eastAsia"/>
                 <w:sz w:val="30"/>
               </w:rPr>
-              <w:t xml:space="preserve">本作品构建C11本地审计与复算工程，接入固定ML-KEM-768便携C实现，用独立NIST向量、接口边界及版本等价验证功能。普通采集在完整解封装窗口内计时，保留逐次记录、公开输入流摘要、源码与产物身份。历史人工分支回归关联源码、机器码、名义统计与掩码对照，明确其教学审计边界。在真实4vCPU KVM/x86_64 Linux取得普通参考及三种编码无分支形态的实现的性能数据；在8个固定无秘密任务上，C与SciPy精确复算结果一致，完整进程墙钟比值中位数0.001389。作品提供统一入口、离线展示与干净复算。新受控防护时序闭环及非原作者执行仍缺，不把未检出、功能通过或复算更快解释为安全认证。</w:t>
+              <w:t xml:space="preserve">本作品构建C11本地审计与复算工程，接入固定ML-KEM-768便携C实现，用独立NIST向量、接口边界及版本等价验证功能。普通采集在完整解封装窗口内计时，保留逐次记录、公开输入流摘要、源码与产物身份。历史人工分支回归关联源码、机器码、名义统计与掩码对照，明确其教学审计边界。在真实4vCPU KVM/x86_64 Linux取得普通参考及三种编码无分支形态的实现的性能数据；在8个固定无秘密任务上，C与SciPy精确复算结果一致，补充预导入对照后的窗口比值中位数0.001562。作品提供统一入口、离线展示与干净复算。新受控防护时序闭环及非原作者执行仍缺，不把未检出、功能通过或复算更快解释为安全认证。</w:t>
             </w:r>
           </w:p>
         </w:tc>
@@ -5360,7 +5360,7 @@
           <w:sz w:val="28"/>
           <w:szCs w:val="28"/>
         </w:rPr>
-        <w:t xml:space="preserve">这支持限定任务的完整进程复算效率增量，启动、读取、统计和输出均计入；Python导入也计入基线。它不说明密码解封装加速、纯计算内核速度、误报率、检出率或密码安全性提高。8个固定任务不代表密码总体，未给总体速度置信区间。此前接口验证和研发完整墙钟未采集，不宣称全研发成本闭合。</w:t>
+        <w:t xml:space="preserve">启动成本敏感性补充沿用这8份任务。SciPy预导入后，48次尾计数仍完全一致，中位窗口比值0.001562070，每份C最大仍小于SciPy最小；基线就绪后49.704188秒，C完整进程0.079016秒，就绪6.559904秒另计。比较观察窗口56.349633秒，未超120秒。这是既有数据的成本边界复核，不是新独立确认、纯内核或密码加速；也不支持灵敏度或安全性提升。固定任务没有总体速度区间，研发完整墙钟未采集。</w:t>
       </w:r>
     </w:p>
     <w:p>
@@ -5423,7 +5423,7 @@
           <w:sz w:val="28"/>
           <w:szCs w:val="28"/>
         </w:rPr>
-        <w:t>图3 每种方法24个完整进程的成本合计，采用对数刻度。源为C观察报告；导入与启动计入SciPy，不作纯内核性能或密码安全声明。</w:t>
+        <w:t>图3 两种成本边界下的精确复算耗时（对数刻度）</w:t>
       </w:r>
     </w:p>
     <w:p>
@@ -6852,7 +6852,7 @@
           <w:sz w:val="28"/>
           <w:szCs w:val="28"/>
         </w:rPr>
-        <w:t xml:space="preserve">证据：E01参考前置，E02普通性能，H01历史审计，C01复算效率，C02有限模型校准，R01作者复现。原CSV字节不变，元数据角色转换另有摘要。重建命令见支撑包source/README.md，非原作者须保留实际日志并本人签收。</w:t>
+        <w:t xml:space="preserve">证据：E01前置，E02性能，H01档案，C01复算，C02模型，C03预导入，R01作者复现。原CSV字节不变，元数据角色转换另有摘要。重建命令见支撑包source/README.md，非原作者须保留实际日志并本人签收。</w:t>
       </w:r>
     </w:p>
     <w:sectPr>

</xml_diff>

<commit_message>
docs: integrate reference label control in official report
</commit_message>
<xml_diff>
--- a/deliverables/report/待编号-2026密码竞赛复赛作品设计报告.docx
+++ b/deliverables/report/待编号-2026密码竞赛复赛作品设计报告.docx
@@ -6541,21 +6541,21 @@
     </w:p>
     <w:p>
       <w:pPr>
-        <w:pStyle w:val="2"/>
+        <w:pStyle w:val="3"/>
         <w:spacing w:before="240" w:after="240" w:line="360" w:lineRule="auto"/>
         <w:rPr>
-          <w:rFonts w:hint="eastAsia" w:ascii="华文楷体" w:hAnsi="华文楷体" w:eastAsia="华文楷体"/>
-          <w:sz w:val="30"/>
-          <w:szCs w:val="30"/>
-        </w:rPr>
-      </w:pPr>
-      <w:r>
-        <w:rPr>
-          <w:rFonts w:hint="eastAsia" w:ascii="华文楷体" w:hAnsi="华文楷体" w:eastAsia="华文楷体"/>
-          <w:sz w:val="30"/>
-          <w:szCs w:val="30"/>
-        </w:rPr>
-        <w:t xml:space="preserve">4.应用前景</w:t>
+          <w:rFonts w:ascii="Times New Roman" w:hAnsi="Times New Roman" w:eastAsia="黑体" w:cs="Times New Roman"/>
+          <w:sz w:val="28"/>
+          <w:szCs w:val="28"/>
+        </w:rPr>
+      </w:pPr>
+      <w:r>
+        <w:rPr>
+          <w:rFonts w:ascii="Times New Roman" w:hAnsi="Times New Roman" w:eastAsia="黑体" w:cs="Times New Roman"/>
+          <w:sz w:val="28"/>
+          <w:szCs w:val="28"/>
+        </w:rPr>
+        <w:t>3.6 真实参考时间的后赋标签控制</w:t>
       </w:r>
     </w:p>
     <w:p>
@@ -6578,7 +6578,7 @@
           <w:sz w:val="28"/>
           <w:szCs w:val="28"/>
         </w:rPr>
-        <w:t xml:space="preserve">作品可作为本地密码实现审计教学及工程复核工具。开发者可以先确认功能和接口，再保存普通运行的完整记录；使用者可从指定文件重分析，核对方法、源身份和限制，减少“只有一个p值”或“只看源码分支”的错误判断。</w:t>
+        <w:t>C04使用E02六份封存普通参考记录。程序完整读取每份3000条及meta/cost并核验资格，每块固定取原序0至23组成12对；采集后独立等概率交换标签，遍历全部4096种组合。时间值不添加偏移，也不按原密文类别或秘密分类。保存144个原时间及24576份差值和计数，新解封装调用为0。</w:t>
       </w:r>
     </w:p>
     <w:p>
@@ -6601,26 +6601,7 @@
           <w:sz w:val="28"/>
           <w:szCs w:val="28"/>
         </w:rPr>
-        <w:t xml:space="preserve">适用范围是单机ML-KEM-768便携C实现、本地运行与离线复算。未来需要团队在批准的防御测试计划下取得新的受控防护前后数据、进行必要的因果分离，并由实际未参与实现的成员独立执行。云宿主控制不足、其他处理器、优化条件或网络环境的变化都需要新的身份和证据，不能用现有数字外推。</w:t>
-      </w:r>
-    </w:p>
-    <w:p>
-      <w:pPr>
-        <w:pStyle w:val="2"/>
-        <w:spacing w:before="240" w:after="240" w:line="360" w:lineRule="auto"/>
-        <w:rPr>
-          <w:rFonts w:hint="eastAsia" w:ascii="华文楷体" w:hAnsi="华文楷体" w:eastAsia="华文楷体"/>
-          <w:sz w:val="30"/>
-          <w:szCs w:val="30"/>
-        </w:rPr>
-      </w:pPr>
-      <w:r>
-        <w:rPr>
-          <w:rFonts w:hint="eastAsia" w:ascii="华文楷体" w:hAnsi="华文楷体" w:eastAsia="华文楷体"/>
-          <w:sz w:val="30"/>
-          <w:szCs w:val="30"/>
-        </w:rPr>
-        <w:t xml:space="preserve">5. 结论</w:t>
+        <w:t>整数精确结果与独立逐项求和、排序秩核验逐行一致，24份预定SciPy审计一致，完整动态运行的原始行也一致。表4给出全部六块结果，各自的条件拒绝概率不超过0.01。C任务约0.209秒，读取、计算和原始记录关闭均计入，最终摘要及状态发布另列。</w:t>
       </w:r>
     </w:p>
     <w:p>
@@ -6635,6 +6616,7 @@
           <w:sz w:val="28"/>
           <w:szCs w:val="28"/>
         </w:rPr>
+        <w:keepNext/>
       </w:pPr>
       <w:r>
         <w:rPr>
@@ -6643,9 +6625,627 @@
           <w:sz w:val="28"/>
           <w:szCs w:val="28"/>
         </w:rPr>
-        <w:t xml:space="preserve">作品已形成可运行的C11工程、统一使用入口、真实原生普通测量、历史防御案例档案、无秘密精确统计验证、限定强对照效率结果及原始数据复算材料。功能正确、记录完整、有限复算效率和密码安全是四类不同结论。</w:t>
-      </w:r>
-    </w:p>
+        <w:t>表4 后赋标签模型的条件拒绝数 每块4096种标签</w:t>
+      </w:r>
+    </w:p>
+    <w:tbl>
+      <w:tblPr>
+        <w:tblW w:w="9638" w:type="dxa"/>
+        <w:tblBorders>
+          <w:top w:val="single" w:sz="4" w:color="8899A5"/>
+          <w:left w:val="single" w:sz="4" w:color="8899A5"/>
+          <w:bottom w:val="single" w:sz="4" w:color="8899A5"/>
+          <w:right w:val="single" w:sz="4" w:color="8899A5"/>
+          <w:insideH w:val="single" w:sz="4" w:color="8899A5"/>
+          <w:insideV w:val="single" w:sz="4" w:color="8899A5"/>
+        </w:tblBorders>
+      </w:tblPr>
+      <w:tr>
+        <w:trPr>
+          <w:tblHeader/>
+        </w:trPr>
+        <w:tc>
+          <w:tcPr>
+            <w:tcW w:w="3212" w:type="dxa"/>
+          </w:tcPr>
+          <w:p>
+            <w:pPr>
+              <w:widowControl/>
+              <w:adjustRightInd w:val="0"/>
+              <w:snapToGrid w:val="0"/>
+              <w:spacing w:line="480" w:lineRule="exact"/>
+              <w:rPr>
+                <w:rFonts w:ascii="楷体_GB2312" w:hAnsi="Times New Roman" w:eastAsia="楷体_GB2312"/>
+                <w:bCs/>
+                <w:sz w:val="28"/>
+                <w:szCs w:val="28"/>
+              </w:rPr>
+            </w:pPr>
+            <w:r>
+              <w:rPr>
+                <w:rFonts w:hint="eastAsia" w:ascii="楷体_GB2312" w:hAnsi="Times New Roman" w:eastAsia="楷体_GB2312"/>
+                <w:bCs/>
+                <w:sz w:val="28"/>
+                <w:szCs w:val="28"/>
+              </w:rPr>
+              <w:t>运行块</w:t>
+            </w:r>
+          </w:p>
+        </w:tc>
+        <w:tc>
+          <w:tcPr>
+            <w:tcW w:w="3212" w:type="dxa"/>
+          </w:tcPr>
+          <w:p>
+            <w:pPr>
+              <w:widowControl/>
+              <w:adjustRightInd w:val="0"/>
+              <w:snapToGrid w:val="0"/>
+              <w:spacing w:line="480" w:lineRule="exact"/>
+              <w:rPr>
+                <w:rFonts w:ascii="楷体_GB2312" w:hAnsi="Times New Roman" w:eastAsia="楷体_GB2312"/>
+                <w:bCs/>
+                <w:sz w:val="28"/>
+                <w:szCs w:val="28"/>
+              </w:rPr>
+            </w:pPr>
+            <w:r>
+              <w:rPr>
+                <w:rFonts w:hint="eastAsia" w:ascii="楷体_GB2312" w:hAnsi="Times New Roman" w:eastAsia="楷体_GB2312"/>
+                <w:bCs/>
+                <w:sz w:val="28"/>
+                <w:szCs w:val="28"/>
+              </w:rPr>
+              <w:t>条件拒绝数</w:t>
+            </w:r>
+          </w:p>
+        </w:tc>
+        <w:tc>
+          <w:tcPr>
+            <w:tcW w:w="3212" w:type="dxa"/>
+          </w:tcPr>
+          <w:p>
+            <w:pPr>
+              <w:widowControl/>
+              <w:adjustRightInd w:val="0"/>
+              <w:snapToGrid w:val="0"/>
+              <w:spacing w:line="480" w:lineRule="exact"/>
+              <w:rPr>
+                <w:rFonts w:ascii="楷体_GB2312" w:hAnsi="Times New Roman" w:eastAsia="楷体_GB2312"/>
+                <w:bCs/>
+                <w:sz w:val="28"/>
+                <w:szCs w:val="28"/>
+              </w:rPr>
+            </w:pPr>
+            <w:r>
+              <w:rPr>
+                <w:rFonts w:hint="eastAsia" w:ascii="楷体_GB2312" w:hAnsi="Times New Roman" w:eastAsia="楷体_GB2312"/>
+                <w:bCs/>
+                <w:sz w:val="28"/>
+                <w:szCs w:val="28"/>
+              </w:rPr>
+              <w:t>条件概率</w:t>
+            </w:r>
+          </w:p>
+        </w:tc>
+      </w:tr>
+      <w:tr>
+        <w:tc>
+          <w:tcPr>
+            <w:tcW w:w="3212" w:type="dxa"/>
+          </w:tcPr>
+          <w:p>
+            <w:pPr>
+              <w:widowControl/>
+              <w:adjustRightInd w:val="0"/>
+              <w:snapToGrid w:val="0"/>
+              <w:spacing w:line="480" w:lineRule="exact"/>
+              <w:rPr>
+                <w:rFonts w:ascii="楷体_GB2312" w:hAnsi="Times New Roman" w:eastAsia="楷体_GB2312"/>
+                <w:bCs/>
+                <w:sz w:val="28"/>
+                <w:szCs w:val="28"/>
+              </w:rPr>
+            </w:pPr>
+            <w:r>
+              <w:rPr>
+                <w:rFonts w:hint="eastAsia" w:ascii="楷体_GB2312" w:hAnsi="Times New Roman" w:eastAsia="楷体_GB2312"/>
+                <w:bCs/>
+                <w:sz w:val="28"/>
+                <w:szCs w:val="28"/>
+              </w:rPr>
+              <w:t>1</w:t>
+            </w:r>
+          </w:p>
+        </w:tc>
+        <w:tc>
+          <w:tcPr>
+            <w:tcW w:w="3212" w:type="dxa"/>
+          </w:tcPr>
+          <w:p>
+            <w:pPr>
+              <w:widowControl/>
+              <w:adjustRightInd w:val="0"/>
+              <w:snapToGrid w:val="0"/>
+              <w:spacing w:line="480" w:lineRule="exact"/>
+              <w:rPr>
+                <w:rFonts w:ascii="楷体_GB2312" w:hAnsi="Times New Roman" w:eastAsia="楷体_GB2312"/>
+                <w:bCs/>
+                <w:sz w:val="28"/>
+                <w:szCs w:val="28"/>
+              </w:rPr>
+            </w:pPr>
+            <w:r>
+              <w:rPr>
+                <w:rFonts w:hint="eastAsia" w:ascii="楷体_GB2312" w:hAnsi="Times New Roman" w:eastAsia="楷体_GB2312"/>
+                <w:bCs/>
+                <w:sz w:val="28"/>
+                <w:szCs w:val="28"/>
+              </w:rPr>
+              <w:t>40</w:t>
+            </w:r>
+          </w:p>
+        </w:tc>
+        <w:tc>
+          <w:tcPr>
+            <w:tcW w:w="3212" w:type="dxa"/>
+          </w:tcPr>
+          <w:p>
+            <w:pPr>
+              <w:widowControl/>
+              <w:adjustRightInd w:val="0"/>
+              <w:snapToGrid w:val="0"/>
+              <w:spacing w:line="480" w:lineRule="exact"/>
+              <w:rPr>
+                <w:rFonts w:ascii="楷体_GB2312" w:hAnsi="Times New Roman" w:eastAsia="楷体_GB2312"/>
+                <w:bCs/>
+                <w:sz w:val="28"/>
+                <w:szCs w:val="28"/>
+              </w:rPr>
+            </w:pPr>
+            <w:r>
+              <w:rPr>
+                <w:rFonts w:hint="eastAsia" w:ascii="楷体_GB2312" w:hAnsi="Times New Roman" w:eastAsia="楷体_GB2312"/>
+                <w:bCs/>
+                <w:sz w:val="28"/>
+                <w:szCs w:val="28"/>
+              </w:rPr>
+              <w:t>0.009765625000</w:t>
+            </w:r>
+          </w:p>
+        </w:tc>
+      </w:tr>
+      <w:tr>
+        <w:tc>
+          <w:tcPr>
+            <w:tcW w:w="3212" w:type="dxa"/>
+          </w:tcPr>
+          <w:p>
+            <w:pPr>
+              <w:widowControl/>
+              <w:adjustRightInd w:val="0"/>
+              <w:snapToGrid w:val="0"/>
+              <w:spacing w:line="480" w:lineRule="exact"/>
+              <w:rPr>
+                <w:rFonts w:ascii="楷体_GB2312" w:hAnsi="Times New Roman" w:eastAsia="楷体_GB2312"/>
+                <w:bCs/>
+                <w:sz w:val="28"/>
+                <w:szCs w:val="28"/>
+              </w:rPr>
+            </w:pPr>
+            <w:r>
+              <w:rPr>
+                <w:rFonts w:hint="eastAsia" w:ascii="楷体_GB2312" w:hAnsi="Times New Roman" w:eastAsia="楷体_GB2312"/>
+                <w:bCs/>
+                <w:sz w:val="28"/>
+                <w:szCs w:val="28"/>
+              </w:rPr>
+              <w:t>2</w:t>
+            </w:r>
+          </w:p>
+        </w:tc>
+        <w:tc>
+          <w:tcPr>
+            <w:tcW w:w="3212" w:type="dxa"/>
+          </w:tcPr>
+          <w:p>
+            <w:pPr>
+              <w:widowControl/>
+              <w:adjustRightInd w:val="0"/>
+              <w:snapToGrid w:val="0"/>
+              <w:spacing w:line="480" w:lineRule="exact"/>
+              <w:rPr>
+                <w:rFonts w:ascii="楷体_GB2312" w:hAnsi="Times New Roman" w:eastAsia="楷体_GB2312"/>
+                <w:bCs/>
+                <w:sz w:val="28"/>
+                <w:szCs w:val="28"/>
+              </w:rPr>
+            </w:pPr>
+            <w:r>
+              <w:rPr>
+                <w:rFonts w:hint="eastAsia" w:ascii="楷体_GB2312" w:hAnsi="Times New Roman" w:eastAsia="楷体_GB2312"/>
+                <w:bCs/>
+                <w:sz w:val="28"/>
+                <w:szCs w:val="28"/>
+              </w:rPr>
+              <w:t>40</w:t>
+            </w:r>
+          </w:p>
+        </w:tc>
+        <w:tc>
+          <w:tcPr>
+            <w:tcW w:w="3212" w:type="dxa"/>
+          </w:tcPr>
+          <w:p>
+            <w:pPr>
+              <w:widowControl/>
+              <w:adjustRightInd w:val="0"/>
+              <w:snapToGrid w:val="0"/>
+              <w:spacing w:line="480" w:lineRule="exact"/>
+              <w:rPr>
+                <w:rFonts w:ascii="楷体_GB2312" w:hAnsi="Times New Roman" w:eastAsia="楷体_GB2312"/>
+                <w:bCs/>
+                <w:sz w:val="28"/>
+                <w:szCs w:val="28"/>
+              </w:rPr>
+            </w:pPr>
+            <w:r>
+              <w:rPr>
+                <w:rFonts w:hint="eastAsia" w:ascii="楷体_GB2312" w:hAnsi="Times New Roman" w:eastAsia="楷体_GB2312"/>
+                <w:bCs/>
+                <w:sz w:val="28"/>
+                <w:szCs w:val="28"/>
+              </w:rPr>
+              <w:t>0.009765625000</w:t>
+            </w:r>
+          </w:p>
+        </w:tc>
+      </w:tr>
+      <w:tr>
+        <w:tc>
+          <w:tcPr>
+            <w:tcW w:w="3212" w:type="dxa"/>
+          </w:tcPr>
+          <w:p>
+            <w:pPr>
+              <w:widowControl/>
+              <w:adjustRightInd w:val="0"/>
+              <w:snapToGrid w:val="0"/>
+              <w:spacing w:line="480" w:lineRule="exact"/>
+              <w:rPr>
+                <w:rFonts w:ascii="楷体_GB2312" w:hAnsi="Times New Roman" w:eastAsia="楷体_GB2312"/>
+                <w:bCs/>
+                <w:sz w:val="28"/>
+                <w:szCs w:val="28"/>
+              </w:rPr>
+            </w:pPr>
+            <w:r>
+              <w:rPr>
+                <w:rFonts w:hint="eastAsia" w:ascii="楷体_GB2312" w:hAnsi="Times New Roman" w:eastAsia="楷体_GB2312"/>
+                <w:bCs/>
+                <w:sz w:val="28"/>
+                <w:szCs w:val="28"/>
+              </w:rPr>
+              <w:t>3</w:t>
+            </w:r>
+          </w:p>
+        </w:tc>
+        <w:tc>
+          <w:tcPr>
+            <w:tcW w:w="3212" w:type="dxa"/>
+          </w:tcPr>
+          <w:p>
+            <w:pPr>
+              <w:widowControl/>
+              <w:adjustRightInd w:val="0"/>
+              <w:snapToGrid w:val="0"/>
+              <w:spacing w:line="480" w:lineRule="exact"/>
+              <w:rPr>
+                <w:rFonts w:ascii="楷体_GB2312" w:hAnsi="Times New Roman" w:eastAsia="楷体_GB2312"/>
+                <w:bCs/>
+                <w:sz w:val="28"/>
+                <w:szCs w:val="28"/>
+              </w:rPr>
+            </w:pPr>
+            <w:r>
+              <w:rPr>
+                <w:rFonts w:hint="eastAsia" w:ascii="楷体_GB2312" w:hAnsi="Times New Roman" w:eastAsia="楷体_GB2312"/>
+                <w:bCs/>
+                <w:sz w:val="28"/>
+                <w:szCs w:val="28"/>
+              </w:rPr>
+              <w:t>40</w:t>
+            </w:r>
+          </w:p>
+        </w:tc>
+        <w:tc>
+          <w:tcPr>
+            <w:tcW w:w="3212" w:type="dxa"/>
+          </w:tcPr>
+          <w:p>
+            <w:pPr>
+              <w:widowControl/>
+              <w:adjustRightInd w:val="0"/>
+              <w:snapToGrid w:val="0"/>
+              <w:spacing w:line="480" w:lineRule="exact"/>
+              <w:rPr>
+                <w:rFonts w:ascii="楷体_GB2312" w:hAnsi="Times New Roman" w:eastAsia="楷体_GB2312"/>
+                <w:bCs/>
+                <w:sz w:val="28"/>
+                <w:szCs w:val="28"/>
+              </w:rPr>
+            </w:pPr>
+            <w:r>
+              <w:rPr>
+                <w:rFonts w:hint="eastAsia" w:ascii="楷体_GB2312" w:hAnsi="Times New Roman" w:eastAsia="楷体_GB2312"/>
+                <w:bCs/>
+                <w:sz w:val="28"/>
+                <w:szCs w:val="28"/>
+              </w:rPr>
+              <w:t>0.009765625000</w:t>
+            </w:r>
+          </w:p>
+        </w:tc>
+      </w:tr>
+      <w:tr>
+        <w:tc>
+          <w:tcPr>
+            <w:tcW w:w="3212" w:type="dxa"/>
+          </w:tcPr>
+          <w:p>
+            <w:pPr>
+              <w:widowControl/>
+              <w:adjustRightInd w:val="0"/>
+              <w:snapToGrid w:val="0"/>
+              <w:spacing w:line="480" w:lineRule="exact"/>
+              <w:rPr>
+                <w:rFonts w:ascii="楷体_GB2312" w:hAnsi="Times New Roman" w:eastAsia="楷体_GB2312"/>
+                <w:bCs/>
+                <w:sz w:val="28"/>
+                <w:szCs w:val="28"/>
+              </w:rPr>
+            </w:pPr>
+            <w:r>
+              <w:rPr>
+                <w:rFonts w:hint="eastAsia" w:ascii="楷体_GB2312" w:hAnsi="Times New Roman" w:eastAsia="楷体_GB2312"/>
+                <w:bCs/>
+                <w:sz w:val="28"/>
+                <w:szCs w:val="28"/>
+              </w:rPr>
+              <w:t>4</w:t>
+            </w:r>
+          </w:p>
+        </w:tc>
+        <w:tc>
+          <w:tcPr>
+            <w:tcW w:w="3212" w:type="dxa"/>
+          </w:tcPr>
+          <w:p>
+            <w:pPr>
+              <w:widowControl/>
+              <w:adjustRightInd w:val="0"/>
+              <w:snapToGrid w:val="0"/>
+              <w:spacing w:line="480" w:lineRule="exact"/>
+              <w:rPr>
+                <w:rFonts w:ascii="楷体_GB2312" w:hAnsi="Times New Roman" w:eastAsia="楷体_GB2312"/>
+                <w:bCs/>
+                <w:sz w:val="28"/>
+                <w:szCs w:val="28"/>
+              </w:rPr>
+            </w:pPr>
+            <w:r>
+              <w:rPr>
+                <w:rFonts w:hint="eastAsia" w:ascii="楷体_GB2312" w:hAnsi="Times New Roman" w:eastAsia="楷体_GB2312"/>
+                <w:bCs/>
+                <w:sz w:val="28"/>
+                <w:szCs w:val="28"/>
+              </w:rPr>
+              <w:t>38</w:t>
+            </w:r>
+          </w:p>
+        </w:tc>
+        <w:tc>
+          <w:tcPr>
+            <w:tcW w:w="3212" w:type="dxa"/>
+          </w:tcPr>
+          <w:p>
+            <w:pPr>
+              <w:widowControl/>
+              <w:adjustRightInd w:val="0"/>
+              <w:snapToGrid w:val="0"/>
+              <w:spacing w:line="480" w:lineRule="exact"/>
+              <w:rPr>
+                <w:rFonts w:ascii="楷体_GB2312" w:hAnsi="Times New Roman" w:eastAsia="楷体_GB2312"/>
+                <w:bCs/>
+                <w:sz w:val="28"/>
+                <w:szCs w:val="28"/>
+              </w:rPr>
+            </w:pPr>
+            <w:r>
+              <w:rPr>
+                <w:rFonts w:hint="eastAsia" w:ascii="楷体_GB2312" w:hAnsi="Times New Roman" w:eastAsia="楷体_GB2312"/>
+                <w:bCs/>
+                <w:sz w:val="28"/>
+                <w:szCs w:val="28"/>
+              </w:rPr>
+              <w:t>0.009277343750</w:t>
+            </w:r>
+          </w:p>
+        </w:tc>
+      </w:tr>
+      <w:tr>
+        <w:tc>
+          <w:tcPr>
+            <w:tcW w:w="3212" w:type="dxa"/>
+          </w:tcPr>
+          <w:p>
+            <w:pPr>
+              <w:widowControl/>
+              <w:adjustRightInd w:val="0"/>
+              <w:snapToGrid w:val="0"/>
+              <w:spacing w:line="480" w:lineRule="exact"/>
+              <w:rPr>
+                <w:rFonts w:ascii="楷体_GB2312" w:hAnsi="Times New Roman" w:eastAsia="楷体_GB2312"/>
+                <w:bCs/>
+                <w:sz w:val="28"/>
+                <w:szCs w:val="28"/>
+              </w:rPr>
+            </w:pPr>
+            <w:r>
+              <w:rPr>
+                <w:rFonts w:hint="eastAsia" w:ascii="楷体_GB2312" w:hAnsi="Times New Roman" w:eastAsia="楷体_GB2312"/>
+                <w:bCs/>
+                <w:sz w:val="28"/>
+                <w:szCs w:val="28"/>
+              </w:rPr>
+              <w:t>5</w:t>
+            </w:r>
+          </w:p>
+        </w:tc>
+        <w:tc>
+          <w:tcPr>
+            <w:tcW w:w="3212" w:type="dxa"/>
+          </w:tcPr>
+          <w:p>
+            <w:pPr>
+              <w:widowControl/>
+              <w:adjustRightInd w:val="0"/>
+              <w:snapToGrid w:val="0"/>
+              <w:spacing w:line="480" w:lineRule="exact"/>
+              <w:rPr>
+                <w:rFonts w:ascii="楷体_GB2312" w:hAnsi="Times New Roman" w:eastAsia="楷体_GB2312"/>
+                <w:bCs/>
+                <w:sz w:val="28"/>
+                <w:szCs w:val="28"/>
+              </w:rPr>
+            </w:pPr>
+            <w:r>
+              <w:rPr>
+                <w:rFonts w:hint="eastAsia" w:ascii="楷体_GB2312" w:hAnsi="Times New Roman" w:eastAsia="楷体_GB2312"/>
+                <w:bCs/>
+                <w:sz w:val="28"/>
+                <w:szCs w:val="28"/>
+              </w:rPr>
+              <w:t>40</w:t>
+            </w:r>
+          </w:p>
+        </w:tc>
+        <w:tc>
+          <w:tcPr>
+            <w:tcW w:w="3212" w:type="dxa"/>
+          </w:tcPr>
+          <w:p>
+            <w:pPr>
+              <w:widowControl/>
+              <w:adjustRightInd w:val="0"/>
+              <w:snapToGrid w:val="0"/>
+              <w:spacing w:line="480" w:lineRule="exact"/>
+              <w:rPr>
+                <w:rFonts w:ascii="楷体_GB2312" w:hAnsi="Times New Roman" w:eastAsia="楷体_GB2312"/>
+                <w:bCs/>
+                <w:sz w:val="28"/>
+                <w:szCs w:val="28"/>
+              </w:rPr>
+            </w:pPr>
+            <w:r>
+              <w:rPr>
+                <w:rFonts w:hint="eastAsia" w:ascii="楷体_GB2312" w:hAnsi="Times New Roman" w:eastAsia="楷体_GB2312"/>
+                <w:bCs/>
+                <w:sz w:val="28"/>
+                <w:szCs w:val="28"/>
+              </w:rPr>
+              <w:t>0.009765625000</w:t>
+            </w:r>
+          </w:p>
+        </w:tc>
+      </w:tr>
+      <w:tr>
+        <w:tc>
+          <w:tcPr>
+            <w:tcW w:w="3212" w:type="dxa"/>
+          </w:tcPr>
+          <w:p>
+            <w:pPr>
+              <w:widowControl/>
+              <w:adjustRightInd w:val="0"/>
+              <w:snapToGrid w:val="0"/>
+              <w:spacing w:line="480" w:lineRule="exact"/>
+              <w:rPr>
+                <w:rFonts w:ascii="楷体_GB2312" w:hAnsi="Times New Roman" w:eastAsia="楷体_GB2312"/>
+                <w:bCs/>
+                <w:sz w:val="28"/>
+                <w:szCs w:val="28"/>
+              </w:rPr>
+            </w:pPr>
+            <w:r>
+              <w:rPr>
+                <w:rFonts w:hint="eastAsia" w:ascii="楷体_GB2312" w:hAnsi="Times New Roman" w:eastAsia="楷体_GB2312"/>
+                <w:bCs/>
+                <w:sz w:val="28"/>
+                <w:szCs w:val="28"/>
+              </w:rPr>
+              <w:t>6</w:t>
+            </w:r>
+          </w:p>
+        </w:tc>
+        <w:tc>
+          <w:tcPr>
+            <w:tcW w:w="3212" w:type="dxa"/>
+          </w:tcPr>
+          <w:p>
+            <w:pPr>
+              <w:widowControl/>
+              <w:adjustRightInd w:val="0"/>
+              <w:snapToGrid w:val="0"/>
+              <w:spacing w:line="480" w:lineRule="exact"/>
+              <w:rPr>
+                <w:rFonts w:ascii="楷体_GB2312" w:hAnsi="Times New Roman" w:eastAsia="楷体_GB2312"/>
+                <w:bCs/>
+                <w:sz w:val="28"/>
+                <w:szCs w:val="28"/>
+              </w:rPr>
+            </w:pPr>
+            <w:r>
+              <w:rPr>
+                <w:rFonts w:hint="eastAsia" w:ascii="楷体_GB2312" w:hAnsi="Times New Roman" w:eastAsia="楷体_GB2312"/>
+                <w:bCs/>
+                <w:sz w:val="28"/>
+                <w:szCs w:val="28"/>
+              </w:rPr>
+              <w:t>38</w:t>
+            </w:r>
+          </w:p>
+        </w:tc>
+        <w:tc>
+          <w:tcPr>
+            <w:tcW w:w="3212" w:type="dxa"/>
+          </w:tcPr>
+          <w:p>
+            <w:pPr>
+              <w:widowControl/>
+              <w:adjustRightInd w:val="0"/>
+              <w:snapToGrid w:val="0"/>
+              <w:spacing w:line="480" w:lineRule="exact"/>
+              <w:rPr>
+                <w:rFonts w:ascii="楷体_GB2312" w:hAnsi="Times New Roman" w:eastAsia="楷体_GB2312"/>
+                <w:bCs/>
+                <w:sz w:val="28"/>
+                <w:szCs w:val="28"/>
+              </w:rPr>
+            </w:pPr>
+            <w:r>
+              <w:rPr>
+                <w:rFonts w:hint="eastAsia" w:ascii="楷体_GB2312" w:hAnsi="Times New Roman" w:eastAsia="楷体_GB2312"/>
+                <w:bCs/>
+                <w:sz w:val="28"/>
+                <w:szCs w:val="28"/>
+              </w:rPr>
+              <w:t>0.009277343750</w:t>
+            </w:r>
+          </w:p>
+        </w:tc>
+      </w:tr>
+    </w:tbl>
     <w:p>
       <w:pPr>
         <w:widowControl/>
@@ -6666,26 +7266,7 @@
           <w:sz w:val="28"/>
           <w:szCs w:val="28"/>
         </w:rPr>
-        <w:t xml:space="preserve">演示的实际界面截图因工具本地文件访问策略受限，未取得；离线页面和真实程序日志已提供，截图需团队手工完成。未闭合项仍包括新受控防护时序闭环、历史差异的完整因果分离、运行独立性校准和真实非原作者执行。新平台普通性能与静态产物核验不能替代这些证据。作品编号、正式题名、实际分工、签字、意见和盖章由团队真实填写及完成；本报告不宣称已经正式提交或全部要求达标。</w:t>
-      </w:r>
-    </w:p>
-    <w:p>
-      <w:pPr>
-        <w:pStyle w:val="2"/>
-        <w:spacing w:before="240" w:after="240" w:line="360" w:lineRule="auto"/>
-        <w:rPr>
-          <w:rFonts w:hint="eastAsia" w:ascii="华文楷体" w:hAnsi="华文楷体" w:eastAsia="华文楷体"/>
-          <w:sz w:val="30"/>
-          <w:szCs w:val="30"/>
-        </w:rPr>
-      </w:pPr>
-      <w:r>
-        <w:rPr>
-          <w:rFonts w:hint="eastAsia" w:ascii="华文楷体" w:hAnsi="华文楷体" w:eastAsia="华文楷体"/>
-          <w:sz w:val="30"/>
-          <w:szCs w:val="30"/>
-        </w:rPr>
-        <w:t xml:space="preserve">6 来源与复现材料</w:t>
+        <w:t>表4 来源：C04完整标签记录及C报告；条件概率以4096为分母，无Monte Carlo抽样误差，不是总体误报率估计。</w:t>
       </w:r>
     </w:p>
     <w:p>
@@ -6700,7 +7281,6 @@
           <w:sz w:val="28"/>
           <w:szCs w:val="28"/>
         </w:rPr>
-        <w:jc w:val="left"/>
       </w:pPr>
       <w:r>
         <w:rPr>
@@ -6709,7 +7289,26 @@
           <w:sz w:val="28"/>
           <w:szCs w:val="28"/>
         </w:rPr>
-        <w:t xml:space="preserve">[1] NIST. Module-Lattice-Based Key-Encapsulation Mechanism Standard. FIPS 203, 2024. https://csrc.nist.gov/pubs/fips/203/final</w:t>
+        <w:t>这只验证给定时间对后独立标签模型的条件错误控制，不要求这些给定时间值iid；不代表采集时实施了该随机化，也不校准原密文类别或真实密码总体。初版遗漏成本内容校验，未签收并保留；修复复用共用C读取器，时钟、身份、计数或成本矛盾在输出数据前被拒绝。旧统计规则和原始时间不改。</w:t>
+      </w:r>
+    </w:p>
+    <w:p>
+      <w:pPr>
+        <w:pStyle w:val="2"/>
+        <w:spacing w:before="240" w:after="240" w:line="360" w:lineRule="auto"/>
+        <w:rPr>
+          <w:rFonts w:hint="eastAsia" w:ascii="华文楷体" w:hAnsi="华文楷体" w:eastAsia="华文楷体"/>
+          <w:sz w:val="30"/>
+          <w:szCs w:val="30"/>
+        </w:rPr>
+      </w:pPr>
+      <w:r>
+        <w:rPr>
+          <w:rFonts w:hint="eastAsia" w:ascii="华文楷体" w:hAnsi="华文楷体" w:eastAsia="华文楷体"/>
+          <w:sz w:val="30"/>
+          <w:szCs w:val="30"/>
+        </w:rPr>
+        <w:t xml:space="preserve">4.应用前景</w:t>
       </w:r>
     </w:p>
     <w:p>
@@ -6724,7 +7323,6 @@
           <w:sz w:val="28"/>
           <w:szCs w:val="28"/>
         </w:rPr>
-        <w:jc w:val="left"/>
       </w:pPr>
       <w:r>
         <w:rPr>
@@ -6733,7 +7331,7 @@
           <w:sz w:val="28"/>
           <w:szCs w:val="28"/>
         </w:rPr>
-        <w:t xml:space="preserve">[2] pq-code-package. mlkem-native. 固定b3ba7b32773e657dd37f6f87bce82528459ad8a4；许可证见源码原件。https://github.com/pq-code-package/mlkem-native</w:t>
+        <w:t xml:space="preserve">作品可作为本地密码实现审计教学及工程复核工具。开发者可以先确认功能和接口，再保存普通运行的完整记录；使用者可从指定文件重分析，核对方法、源身份和限制，减少“只有一个p值”或“只看源码分支”的错误判断。</w:t>
       </w:r>
     </w:p>
     <w:p>
@@ -6748,7 +7346,6 @@
           <w:sz w:val="28"/>
           <w:szCs w:val="28"/>
         </w:rPr>
-        <w:jc w:val="left"/>
       </w:pPr>
       <w:r>
         <w:rPr>
@@ -6757,7 +7354,26 @@
           <w:sz w:val="28"/>
           <w:szCs w:val="28"/>
         </w:rPr>
-        <w:t xml:space="preserve">[3] Reparaz O, Balasch J, Verbauwhede I. Dude, is my code constant time? DATE 2017；dudect固定dc269651fb2567e46755cfb2a13d3875592968b5。https://github.com/oreparaz/dudect</w:t>
+        <w:t xml:space="preserve">适用范围是单机ML-KEM-768便携C实现、本地运行与离线复算。未来需要团队在批准的防御测试计划下取得新的受控防护前后数据、进行必要的因果分离，并由实际未参与实现的成员独立执行。云宿主控制不足、其他处理器、优化条件或网络环境的变化都需要新的身份和证据，不能用现有数字外推。</w:t>
+      </w:r>
+    </w:p>
+    <w:p>
+      <w:pPr>
+        <w:pStyle w:val="2"/>
+        <w:spacing w:before="240" w:after="240" w:line="360" w:lineRule="auto"/>
+        <w:rPr>
+          <w:rFonts w:hint="eastAsia" w:ascii="华文楷体" w:hAnsi="华文楷体" w:eastAsia="华文楷体"/>
+          <w:sz w:val="30"/>
+          <w:szCs w:val="30"/>
+        </w:rPr>
+      </w:pPr>
+      <w:r>
+        <w:rPr>
+          <w:rFonts w:hint="eastAsia" w:ascii="华文楷体" w:hAnsi="华文楷体" w:eastAsia="华文楷体"/>
+          <w:sz w:val="30"/>
+          <w:szCs w:val="30"/>
+        </w:rPr>
+        <w:t xml:space="preserve">5. 结论</w:t>
       </w:r>
     </w:p>
     <w:p>
@@ -6772,7 +7388,6 @@
           <w:sz w:val="28"/>
           <w:szCs w:val="28"/>
         </w:rPr>
-        <w:jc w:val="left"/>
       </w:pPr>
       <w:r>
         <w:rPr>
@@ -6781,7 +7396,7 @@
           <w:sz w:val="28"/>
           <w:szCs w:val="28"/>
         </w:rPr>
-        <w:t xml:space="preserve">[4] Dunsche M, et al. With Great Power Come Great Side Channels: Statistical Timing Side-Channel Analyses with Bounded Type-1 Errors. USENIX Security 2024；已核对官方勘误。https://www.usenix.org/conference/usenixsecurity24/presentation/dunsche</w:t>
+        <w:t xml:space="preserve">作品已形成可运行的C11工程、统一使用入口、真实原生普通测量、历史防御案例档案、无秘密精确统计验证、限定强对照效率结果及原始数据复算材料。功能正确、记录完整、有限复算效率和密码安全是四类不同结论。</w:t>
       </w:r>
     </w:p>
     <w:p>
@@ -6796,7 +7411,6 @@
           <w:sz w:val="28"/>
           <w:szCs w:val="28"/>
         </w:rPr>
-        <w:jc w:val="left"/>
       </w:pPr>
       <w:r>
         <w:rPr>
@@ -6805,7 +7419,26 @@
           <w:sz w:val="28"/>
           <w:szCs w:val="28"/>
         </w:rPr>
-        <w:t xml:space="preserve">[5] SciPy. permutation_test官方定义；对照实际版本SciPy1.16.3/NumPy2.3.5。https://docs.scipy.org/doc/scipy/reference/generated/scipy.stats.permutation_test.html</w:t>
+        <w:t xml:space="preserve">演示的实际界面截图因工具本地文件访问策略受限，未取得；离线页面和真实程序日志已提供，截图需团队手工完成。未闭合项仍包括新受控防护时序闭环、历史差异的完整因果分离、运行独立性校准和真实非原作者执行。新平台普通性能与静态产物核验不能替代这些证据。作品编号、正式题名、实际分工、签字、意见和盖章由团队真实填写及完成；本报告不宣称已经正式提交或全部要求达标。</w:t>
+      </w:r>
+    </w:p>
+    <w:p>
+      <w:pPr>
+        <w:pStyle w:val="2"/>
+        <w:spacing w:before="240" w:after="240" w:line="360" w:lineRule="auto"/>
+        <w:rPr>
+          <w:rFonts w:hint="eastAsia" w:ascii="华文楷体" w:hAnsi="华文楷体" w:eastAsia="华文楷体"/>
+          <w:sz w:val="30"/>
+          <w:szCs w:val="30"/>
+        </w:rPr>
+      </w:pPr>
+      <w:r>
+        <w:rPr>
+          <w:rFonts w:hint="eastAsia" w:ascii="华文楷体" w:hAnsi="华文楷体" w:eastAsia="华文楷体"/>
+          <w:sz w:val="30"/>
+          <w:szCs w:val="30"/>
+        </w:rPr>
+        <w:t xml:space="preserve">6 来源与复现材料</w:t>
       </w:r>
     </w:p>
     <w:p>
@@ -6829,7 +7462,7 @@
           <w:sz w:val="28"/>
           <w:szCs w:val="28"/>
         </w:rPr>
-        <w:t xml:space="preserve">[6] clangover机制出处固定7f4d5dc162b77c362a34a0d52949f7a3e1b16d81，原对象是旧Kyber，不能冒称FIPS 203。https://github.com/antoonpurnal/clangover</w:t>
+        <w:t xml:space="preserve">[1] NIST. Module-Lattice-Based Key-Encapsulation Mechanism Standard. FIPS 203, 2024. https://csrc.nist.gov/pubs/fips/203/final</w:t>
       </w:r>
     </w:p>
     <w:p>
@@ -6844,6 +7477,7 @@
           <w:sz w:val="28"/>
           <w:szCs w:val="28"/>
         </w:rPr>
+        <w:jc w:val="left"/>
       </w:pPr>
       <w:r>
         <w:rPr>
@@ -6852,7 +7486,126 @@
           <w:sz w:val="28"/>
           <w:szCs w:val="28"/>
         </w:rPr>
-        <w:t xml:space="preserve">证据：E01前置，E02性能，H01档案，C01复算，C02模型，C03预导入，R01作者复现。原CSV字节不变，元数据角色转换另有摘要。重建命令见支撑包source/README.md，非原作者须保留实际日志并本人签收。</w:t>
+        <w:t xml:space="preserve">[2] pq-code-package. mlkem-native. 固定b3ba7b32773e657dd37f6f87bce82528459ad8a4；许可证见源码原件。https://github.com/pq-code-package/mlkem-native</w:t>
+      </w:r>
+    </w:p>
+    <w:p>
+      <w:pPr>
+        <w:widowControl/>
+        <w:adjustRightInd w:val="0"/>
+        <w:snapToGrid w:val="0"/>
+        <w:spacing w:line="480" w:lineRule="exact"/>
+        <w:rPr>
+          <w:rFonts w:ascii="楷体_GB2312" w:hAnsi="Times New Roman" w:eastAsia="楷体_GB2312"/>
+          <w:bCs/>
+          <w:sz w:val="28"/>
+          <w:szCs w:val="28"/>
+        </w:rPr>
+        <w:jc w:val="left"/>
+      </w:pPr>
+      <w:r>
+        <w:rPr>
+          <w:rFonts w:hint="eastAsia" w:ascii="楷体_GB2312" w:hAnsi="Times New Roman" w:eastAsia="楷体_GB2312"/>
+          <w:bCs/>
+          <w:sz w:val="28"/>
+          <w:szCs w:val="28"/>
+        </w:rPr>
+        <w:t xml:space="preserve">[3] Reparaz O, Balasch J, Verbauwhede I. Dude, is my code constant time? DATE 2017；dudect固定dc269651fb2567e46755cfb2a13d3875592968b5。https://github.com/oreparaz/dudect</w:t>
+      </w:r>
+    </w:p>
+    <w:p>
+      <w:pPr>
+        <w:widowControl/>
+        <w:adjustRightInd w:val="0"/>
+        <w:snapToGrid w:val="0"/>
+        <w:spacing w:line="480" w:lineRule="exact"/>
+        <w:rPr>
+          <w:rFonts w:ascii="楷体_GB2312" w:hAnsi="Times New Roman" w:eastAsia="楷体_GB2312"/>
+          <w:bCs/>
+          <w:sz w:val="28"/>
+          <w:szCs w:val="28"/>
+        </w:rPr>
+        <w:jc w:val="left"/>
+      </w:pPr>
+      <w:r>
+        <w:rPr>
+          <w:rFonts w:hint="eastAsia" w:ascii="楷体_GB2312" w:hAnsi="Times New Roman" w:eastAsia="楷体_GB2312"/>
+          <w:bCs/>
+          <w:sz w:val="28"/>
+          <w:szCs w:val="28"/>
+        </w:rPr>
+        <w:t xml:space="preserve">[4] Dunsche M, et al. With Great Power Come Great Side Channels: Statistical Timing Side-Channel Analyses with Bounded Type-1 Errors. USENIX Security 2024；已核对官方勘误。https://www.usenix.org/conference/usenixsecurity24/presentation/dunsche</w:t>
+      </w:r>
+    </w:p>
+    <w:p>
+      <w:pPr>
+        <w:widowControl/>
+        <w:adjustRightInd w:val="0"/>
+        <w:snapToGrid w:val="0"/>
+        <w:spacing w:line="480" w:lineRule="exact"/>
+        <w:rPr>
+          <w:rFonts w:ascii="楷体_GB2312" w:hAnsi="Times New Roman" w:eastAsia="楷体_GB2312"/>
+          <w:bCs/>
+          <w:sz w:val="28"/>
+          <w:szCs w:val="28"/>
+        </w:rPr>
+        <w:jc w:val="left"/>
+      </w:pPr>
+      <w:r>
+        <w:rPr>
+          <w:rFonts w:hint="eastAsia" w:ascii="楷体_GB2312" w:hAnsi="Times New Roman" w:eastAsia="楷体_GB2312"/>
+          <w:bCs/>
+          <w:sz w:val="28"/>
+          <w:szCs w:val="28"/>
+        </w:rPr>
+        <w:t xml:space="preserve">[5] SciPy. permutation_test官方定义；对照实际版本SciPy1.16.3/NumPy2.3.5。https://docs.scipy.org/doc/scipy/reference/generated/scipy.stats.permutation_test.html</w:t>
+      </w:r>
+    </w:p>
+    <w:p>
+      <w:pPr>
+        <w:widowControl/>
+        <w:adjustRightInd w:val="0"/>
+        <w:snapToGrid w:val="0"/>
+        <w:spacing w:line="480" w:lineRule="exact"/>
+        <w:rPr>
+          <w:rFonts w:ascii="楷体_GB2312" w:hAnsi="Times New Roman" w:eastAsia="楷体_GB2312"/>
+          <w:bCs/>
+          <w:sz w:val="28"/>
+          <w:szCs w:val="28"/>
+        </w:rPr>
+        <w:jc w:val="left"/>
+      </w:pPr>
+      <w:r>
+        <w:rPr>
+          <w:rFonts w:hint="eastAsia" w:ascii="楷体_GB2312" w:hAnsi="Times New Roman" w:eastAsia="楷体_GB2312"/>
+          <w:bCs/>
+          <w:sz w:val="28"/>
+          <w:szCs w:val="28"/>
+        </w:rPr>
+        <w:t xml:space="preserve">[6] clangover机制出处固定7f4d5dc162b77c362a34a0d52949f7a3e1b16d81，原对象是旧Kyber，不能冒称FIPS 203。https://github.com/antoonpurnal/clangover</w:t>
+      </w:r>
+    </w:p>
+    <w:p>
+      <w:pPr>
+        <w:widowControl/>
+        <w:adjustRightInd w:val="0"/>
+        <w:snapToGrid w:val="0"/>
+        <w:spacing w:line="480" w:lineRule="exact"/>
+        <w:rPr>
+          <w:rFonts w:ascii="楷体_GB2312" w:hAnsi="Times New Roman" w:eastAsia="楷体_GB2312"/>
+          <w:bCs/>
+          <w:sz w:val="28"/>
+          <w:szCs w:val="28"/>
+        </w:rPr>
+      </w:pPr>
+      <w:r>
+        <w:rPr>
+          <w:rFonts w:hint="eastAsia" w:ascii="楷体_GB2312" w:hAnsi="Times New Roman" w:eastAsia="楷体_GB2312"/>
+          <w:bCs/>
+          <w:sz w:val="28"/>
+          <w:szCs w:val="28"/>
+        </w:rPr>
+        <w:t xml:space="preserve">证据：E01前置，E02性能，H01档案，C01复算，C02模型，C03预导入，C04后赋标签，R01作者复现。原CSV字节不变，元数据角色转换另有摘要。重建命令见支撑包source/README.md，非原作者须保留实际日志并本人签收。</w:t>
       </w:r>
     </w:p>
     <w:sectPr>

</xml_diff>

<commit_message>
deliver: synchronize official candidate report and verify template and figures
</commit_message>
<xml_diff>
--- a/deliverables/report/待编号-2026密码竞赛复赛作品设计报告.docx
+++ b/deliverables/report/待编号-2026密码竞赛复赛作品设计报告.docx
@@ -1294,6 +1294,29 @@
           <w:sz w:val="28"/>
           <w:szCs w:val="28"/>
         </w:rPr>
+        <w:t xml:space="preserve">本轮公开核查U01与适用审查D01区分旧Kyber、最终ML-KEM、架构后端及固定版本。固定库已有volatile值屏障和相关清理；后续配置、汇编栈标记及ABI问题按实际便携构建排除。C层恒时未形式证明，硬件乘法前提和不可读勘误保留未知。自有修正DEF-F01仅补齐真实构建路径记录，不改变密码运算，也不构成上游新漏洞或防护效果证据。[2]</w:t>
+      </w:r>
+    </w:p>
+    <w:p>
+      <w:pPr>
+        <w:widowControl/>
+        <w:adjustRightInd w:val="0"/>
+        <w:snapToGrid w:val="0"/>
+        <w:spacing w:line="480" w:lineRule="exact"/>
+        <w:rPr>
+          <w:rFonts w:ascii="楷体_GB2312" w:hAnsi="Times New Roman" w:eastAsia="楷体_GB2312"/>
+          <w:bCs/>
+          <w:sz w:val="28"/>
+          <w:szCs w:val="28"/>
+        </w:rPr>
+      </w:pPr>
+      <w:r>
+        <w:rPr>
+          <w:rFonts w:hint="eastAsia" w:ascii="楷体_GB2312" w:hAnsi="Times New Roman" w:eastAsia="楷体_GB2312"/>
+          <w:bCs/>
+          <w:sz w:val="28"/>
+          <w:szCs w:val="28"/>
+        </w:rPr>
         <w:t xml:space="preserve">普通输入为valid、bit-flipped、random三类，比例1:1:1，全部长度1088字节。标签来自生成规则，不来自内部接受标志。输入生成、分配、结果消费及I/O位于计时窗口外，窗口内覆盖完整包装层与内核解封装。数据保存原始顺序，公开种子固定类别乱序，不删除普通长尾。</w:t>
       </w:r>
     </w:p>
@@ -1728,7 +1751,7 @@
           <w:sz w:val="28"/>
           <w:szCs w:val="28"/>
         </w:rPr>
-        <w:t xml:space="preserve">Apple M5/ARM64实现源的普通及ASan/UBSan检查通过。Linux普通测量固定S02在GCC及Clang动态各执行31项，后续只读验收32项；有限模型校准固定S04两种构建各33项。此前GCC sanitizer在既有人工补丁的符号转换警告处失败，原日志保留，没有关闭警告或修改封存补丁。动态检查不冒充正式性能产物。</w:t>
+        <w:t xml:space="preserve">已有S02/S03/S04各按31/32/33项解释。本轮N01在UTC 16:18:45—16:19:13以固定新导出完成GCC13.3普通和Clang18.1.3 ASan/UBSan各34项，四版构建路径及GNU_STACK RW核验通过。40份旧报告与C01—C04主结果逐字一致；这是作者代理复算，非原作者尚未执行。随机open失败已测，read/close故障注入未执行；此前GCC动态构建失败原件保留，未关闭警告或改封存补丁。</w:t>
       </w:r>
     </w:p>
     <w:p>
@@ -1840,6 +1863,29 @@
           <w:szCs w:val="28"/>
         </w:rPr>
         <w:t xml:space="preserve">6个运行对的iid条件在KVM上未得到证明，bootstrap区间仅是该模型下的探索描述，不保证总体覆盖，也不作防护效果判定。hardened保留函数级O0控制，reference/deployable正常优化，比较同时包含优化和代码形态差异；不能把速度差完全归于安全防护。负开销允许存在，不能据此声称更安全。</w:t>
+      </w:r>
+    </w:p>
+    <w:p>
+      <w:pPr>
+        <w:widowControl/>
+        <w:adjustRightInd w:val="0"/>
+        <w:snapToGrid w:val="0"/>
+        <w:spacing w:line="480" w:lineRule="exact"/>
+        <w:rPr>
+          <w:rFonts w:ascii="楷体_GB2312" w:hAnsi="Times New Roman" w:eastAsia="楷体_GB2312"/>
+          <w:bCs/>
+          <w:sz w:val="28"/>
+          <w:szCs w:val="28"/>
+        </w:rPr>
+      </w:pPr>
+      <w:r>
+        <w:rPr>
+          <w:rFonts w:hint="eastAsia" w:ascii="楷体_GB2312" w:hAnsi="Times New Roman" w:eastAsia="楷体_GB2312"/>
+          <w:bCs/>
+          <w:sz w:val="28"/>
+          <w:szCs w:val="28"/>
+        </w:rPr>
+        <w:t xml:space="preserve">本轮N01另采18个普通运行，54000条正式记录和1800次预热；hardened与deployable相对reference开销分别为0.824599%及1.091517%，99%探索区间均跨零，完整父窗口合计4.162秒。新源码及产物另列N01；图2和表1仍为旧E02，两个身份不混用，普通开销不判防护效果。</w:t>
       </w:r>
     </w:p>
     <w:p>
@@ -7396,7 +7442,7 @@
           <w:sz w:val="28"/>
           <w:szCs w:val="28"/>
         </w:rPr>
-        <w:t xml:space="preserve">作品已形成可运行的C11工程、统一使用入口、真实原生普通测量、历史防御案例档案、无秘密精确统计验证、限定强对照效率结果及原始数据复算材料。功能正确、记录完整、有限复算效率和密码安全是四类不同结论。</w:t>
+        <w:t xml:space="preserve">本轮补齐公开来源与固定版本适用性审查，修正构建身份记录中的路径错误，保留算法及历史数据。软件、功能与产物核验、普通性能、既有数据复算分别留证。有限精确复算效率服务于统计检测的核查与复现，不支持ML-KEM加速、检测更灵敏或防护已有效；当前材料为供团队审阅修改的提交候选版。</w:t>
       </w:r>
     </w:p>
     <w:p>
@@ -7486,7 +7532,7 @@
           <w:sz w:val="28"/>
           <w:szCs w:val="28"/>
         </w:rPr>
-        <w:t xml:space="preserve">[2] pq-code-package. mlkem-native. 固定b3ba7b32773e657dd37f6f87bce82528459ad8a4；许可证见源码原件。https://github.com/pq-code-package/mlkem-native</w:t>
+        <w:t xml:space="preserve">[2] pq-code-package. mlkem-native固定快照及证明边界。https://github.com/pq-code-package/mlkem-native/blob/b3ba7b32773e657dd37f6f87bce82528459ad8a4/SOUNDNESS.md；预防性值屏障变更：https://github.com/pq-code-package/mlkem-native/pull/1342。</w:t>
       </w:r>
     </w:p>
     <w:p>
@@ -7605,7 +7651,7 @@
           <w:sz w:val="28"/>
           <w:szCs w:val="28"/>
         </w:rPr>
-        <w:t xml:space="preserve">证据：E01前置，E02性能，H01档案，C01复算，C02模型，C03预导入，C04后赋标签，R01作者复现。原CSV字节不变，元数据角色转换另有摘要。重建命令见支撑包source/README.md，非原作者须保留实际日志并本人签收。</w:t>
+        <w:t xml:space="preserve">证据：U01公开来源，D01固定版本审查，E01前置，E02旧性能，H01人工档案，C01—C04统计复核，R01旧作者复现，N01本轮Linux核验与A02作者代理复算。原CSV不改；公开审查与适用性在source/docs，N01原件在docs/evidence/candidate-round-20261007/native，复算和离线索引入口见支撑包source/README.md。真实非原作者执行须另留本人日志并签收。</w:t>
       </w:r>
     </w:p>
     <w:sectPr>

</xml_diff>

<commit_message>
docs: distinguish report runtime windows and anonymous evidence copies
</commit_message>
<xml_diff>
--- a/deliverables/report/待编号-2026密码竞赛复赛作品设计报告.docx
+++ b/deliverables/report/待编号-2026密码竞赛复赛作品设计报告.docx
@@ -1751,7 +1751,7 @@
           <w:sz w:val="28"/>
           <w:szCs w:val="28"/>
         </w:rPr>
-        <w:t xml:space="preserve">已有S02/S03/S04各按31/32/33项解释。本轮N01在UTC 16:18:45—16:19:13以固定新导出完成GCC13.3普通和Clang18.1.3 ASan/UBSan各34项，四版构建路径及GNU_STACK RW核验通过。40份旧报告与C01—C04主结果逐字一致；这是作者代理复算，非原作者尚未执行。随机open失败已测，read/close故障注入未执行；此前GCC动态构建失败原件保留，未关闭警告或改封存补丁。</w:t>
+        <w:t xml:space="preserve">已有S02/S03/S04各按31/32/33项解释。本轮N01主要执行窗口为UTC 16:18:45—16:19:13，GCC13.3普通及Clang18.1.3 ASan/UBSan各34项通过，GNU_STACK为RW。四版构建路径于UTC 16:22:32另行交叉核对。40份旧报告及C01—C04主结果逐字一致；执行者为作者代理，非原作者尚未执行。随机open失败已测，read/close故障注入未执行；此前GCC动态构建失败内部原件保留，未关闭警告或改封存补丁。</w:t>
       </w:r>
     </w:p>
     <w:p>
@@ -7651,7 +7651,7 @@
           <w:sz w:val="28"/>
           <w:szCs w:val="28"/>
         </w:rPr>
-        <w:t xml:space="preserve">证据：U01公开来源，D01固定版本审查，E01前置，E02旧性能，H01人工档案，C01—C04统计复核，R01旧作者复现，N01本轮Linux核验与A02作者代理复算。原CSV不改；公开审查与适用性在source/docs，N01原件在docs/evidence/candidate-round-20261007/native，复算和离线索引入口见支撑包source/README.md。真实非原作者执行须另留本人日志并签收。</w:t>
+        <w:t xml:space="preserve">证据：U01公开来源，D01固定版本审查，E01前置，E02旧性能，H01人工档案，C01—C04统计复核，A01旧作者复现（旧别名R01），N01本轮Linux核验与A02作者代理复算。原数值CSV不改；运行原件内部保留。支撑包source/docs内含公开审查与适用性，source/docs/evidence/candidate-round-20261007/native为有转换记录的匿名副本，复算与离线索引见source/README.md。真实非原作者须另留本人日志并签收。</w:t>
       </w:r>
     </w:p>
     <w:sectPr>

</xml_diff>